<commit_message>
Fix answer-key errors and revert fabricated 大問4 content
- Correct 大問3 answers (1ア2ウ3イ4エ) after recounting the word-form
  changes (spanning/serves/prevent A from doing/connect A with B)
- Recount 大問8 4th/8th words for all 5 items; several were off by one
  position in the bracket
- Revert 大問4 to a pending placeholder ("教科書原文との照合が必要")
  since its passage/word list/answers were drafted without verifying
  against the actual textbook text

https://claude.ai/code/session_015DW3MeoTGzyTVFtzJFvLng
</commit_message>
<xml_diff>
--- a/output/exam_comm2_final.docx
+++ b/output/exam_comm2_final.docx
@@ -1230,7 +1230,7 @@
           <w:u w:val="none"/>
           <w:highlight w:val="yellow"/>
         </w:rPr>
-        <w:t>１ウ　２エ　３イ　４ア</w:t>
+        <w:t>１ア　２ウ　３イ　４エ</w:t>
       </w:r>
     </w:p>
     <w:p>
@@ -1270,211 +1270,27 @@
         <w:t>（１０点）</w:t>
       </w:r>
     </w:p>
-    <w:tbl>
-      <w:tblPr>
-        <w:tblStyle w:val="TableGrid"/>
-        <w:tblW w:type="auto" w:w="0"/>
-        <w:tblLook w:firstColumn="1" w:firstRow="1" w:lastColumn="0" w:lastRow="0" w:noHBand="0" w:noVBand="1" w:val="04A0"/>
-      </w:tblPr>
-      <w:tblGrid>
-        <w:gridCol w:w="1512"/>
-        <w:gridCol w:w="1512"/>
-        <w:gridCol w:w="1512"/>
-        <w:gridCol w:w="1512"/>
-        <w:gridCol w:w="1512"/>
-        <w:gridCol w:w="1512"/>
-      </w:tblGrid>
-      <w:tr>
-        <w:tc>
-          <w:tcPr>
-            <w:tcW w:type="dxa" w:w="1512"/>
-          </w:tcPr>
-          <w:p>
-            <w:pPr>
-              <w:jc w:val="center"/>
-            </w:pPr>
-            <w:r>
-              <w:rPr>
-                <w:rFonts w:eastAsia="MS Mincho" w:ascii="Times New Roman" w:hAnsi="Times New Roman"/>
-                <w:b w:val="0"/>
-                <w:i w:val="0"/>
-                <w:sz w:val="20"/>
-                <w:u w:val="none"/>
-              </w:rPr>
-              <w:t>0. are</w:t>
-            </w:r>
-          </w:p>
-        </w:tc>
-        <w:tc>
-          <w:tcPr>
-            <w:tcW w:type="dxa" w:w="1512"/>
-          </w:tcPr>
-          <w:p>
-            <w:pPr>
-              <w:jc w:val="center"/>
-            </w:pPr>
-            <w:r>
-              <w:rPr>
-                <w:rFonts w:eastAsia="MS Mincho" w:ascii="Times New Roman" w:hAnsi="Times New Roman"/>
-                <w:b w:val="0"/>
-                <w:i w:val="0"/>
-                <w:sz w:val="20"/>
-                <w:u w:val="none"/>
-              </w:rPr>
-              <w:t>1. once</w:t>
-            </w:r>
-          </w:p>
-        </w:tc>
-        <w:tc>
-          <w:tcPr>
-            <w:tcW w:type="dxa" w:w="1512"/>
-          </w:tcPr>
-          <w:p>
-            <w:pPr>
-              <w:jc w:val="center"/>
-            </w:pPr>
-            <w:r>
-              <w:rPr>
-                <w:rFonts w:eastAsia="MS Mincho" w:ascii="Times New Roman" w:hAnsi="Times New Roman"/>
-                <w:b w:val="0"/>
-                <w:i w:val="0"/>
-                <w:sz w:val="20"/>
-                <w:u w:val="none"/>
-              </w:rPr>
-              <w:t>2. that</w:t>
-            </w:r>
-          </w:p>
-        </w:tc>
-        <w:tc>
-          <w:tcPr>
-            <w:tcW w:type="dxa" w:w="1512"/>
-          </w:tcPr>
-          <w:p>
-            <w:pPr>
-              <w:jc w:val="center"/>
-            </w:pPr>
-            <w:r>
-              <w:rPr>
-                <w:rFonts w:eastAsia="MS Mincho" w:ascii="Times New Roman" w:hAnsi="Times New Roman"/>
-                <w:b w:val="0"/>
-                <w:i w:val="0"/>
-                <w:sz w:val="20"/>
-                <w:u w:val="none"/>
-              </w:rPr>
-              <w:t>3. than</w:t>
-            </w:r>
-          </w:p>
-        </w:tc>
-        <w:tc>
-          <w:tcPr>
-            <w:tcW w:type="dxa" w:w="1512"/>
-          </w:tcPr>
-          <w:p>
-            <w:pPr>
-              <w:jc w:val="center"/>
-            </w:pPr>
-            <w:r>
-              <w:rPr>
-                <w:rFonts w:eastAsia="MS Mincho" w:ascii="Times New Roman" w:hAnsi="Times New Roman"/>
-                <w:b w:val="0"/>
-                <w:i w:val="0"/>
-                <w:sz w:val="20"/>
-                <w:u w:val="none"/>
-              </w:rPr>
-              <w:t>4. driving</w:t>
-            </w:r>
-          </w:p>
-        </w:tc>
-        <w:tc>
-          <w:tcPr>
-            <w:tcW w:type="dxa" w:w="1512"/>
-          </w:tcPr>
-          <w:p>
-            <w:pPr>
-              <w:jc w:val="center"/>
-            </w:pPr>
-            <w:r>
-              <w:rPr>
-                <w:rFonts w:eastAsia="MS Mincho" w:ascii="Times New Roman" w:hAnsi="Times New Roman"/>
-                <w:b w:val="0"/>
-                <w:i w:val="0"/>
-                <w:sz w:val="20"/>
-                <w:u w:val="none"/>
-              </w:rPr>
-              <w:t>5. quicker</w:t>
-            </w:r>
-          </w:p>
-        </w:tc>
-      </w:tr>
-    </w:tbl>
-    <w:p/>
     <w:p>
       <w:pPr>
-        <w:spacing w:before="0" w:after="40"/>
-        <w:ind w:left="170" w:firstLine="0"/>
-      </w:pPr>
-      <w:r>
-        <w:rPr>
-          <w:rFonts w:eastAsia="MS Mincho" w:ascii="Times New Roman" w:hAnsi="Times New Roman"/>
-          <w:b w:val="0"/>
-          <w:i w:val="0"/>
-          <w:sz w:val="21"/>
-          <w:u w:val="none"/>
-        </w:rPr>
-        <w:t>解答例　　（ cubes ） are （ widely ）</w:t>
-      </w:r>
-    </w:p>
-    <w:p>
-      <w:pPr>
-        <w:spacing w:before="40" w:after="0"/>
-        <w:ind w:left="0" w:firstLine="0"/>
-        <w:jc w:val="both"/>
-      </w:pPr>
-      <w:r>
-        <w:rPr>
-          <w:rFonts w:eastAsia="MS Mincho" w:ascii="Times New Roman" w:hAnsi="Times New Roman"/>
-          <w:b w:val="0"/>
-          <w:i w:val="0"/>
-          <w:sz w:val="21"/>
-          <w:u w:val="none"/>
-        </w:rPr>
-        <w:t>Surprisingly, Copenhagen's urban planners used to favor cars over other forms of transportation. The Bicycle Snake bridge, built more recently, serves as a shortcut for cyclists and offers a striking view of the waterfront. As a result, it is now quicker to go downtown by bicycle by car. That has led more people to cycle than .</w:t>
-      </w:r>
-    </w:p>
-    <w:p>
-      <w:pPr>
-        <w:spacing w:before="0" w:after="80"/>
-        <w:ind w:left="0" w:firstLine="0"/>
-        <w:jc w:val="both"/>
-      </w:pPr>
-      <w:r>
-        <w:rPr>
-          <w:rFonts w:eastAsia="MS Mincho" w:ascii="Times New Roman" w:hAnsi="Times New Roman"/>
-          <w:b w:val="0"/>
-          <w:i w:val="0"/>
-          <w:sz w:val="21"/>
-          <w:u w:val="none"/>
-        </w:rPr>
-        <w:t>Making cities healthier and more attractive by adopting bike-friendly policies has come to be known as "Copenhagenization." Even New York is following Copenhagen's example. It has started locating car parking spaces in the middle of the street so vehicles cannot enter the bike lane. Consequently, bicycle traffic has increased 1.6 times. Moreover, there are fewer accidents. The Copenhagen model is changing the world for the better.</w:t>
-      </w:r>
-    </w:p>
-    <w:p>
-      <w:pPr>
-        <w:spacing w:before="40" w:after="120"/>
-        <w:ind w:left="170" w:firstLine="0"/>
+        <w:spacing w:before="80" w:after="80"/>
+        <w:ind w:left="283" w:firstLine="0"/>
       </w:pPr>
       <w:r>
         <w:rPr>
           <w:rFonts w:eastAsia="MS Mincho" w:ascii="Times New Roman" w:hAnsi="Times New Roman"/>
           <w:b/>
           <w:i w:val="0"/>
-          <w:sz w:val="19"/>
+          <w:sz w:val="24"/>
           <w:u w:val="none"/>
-          <w:highlight w:val="yellow"/>
         </w:rPr>
-        <w:t>1.（recently）built（,）　　2.（quicker）to go（downtown）　　3.（by）bicycle（than）　　4.（cycle）than（driving）　　5.（in the middle of the street）so that（vehicles）</w:t>
+        <w:t>（教科書原文との照合が必要：未着手）</w:t>
       </w:r>
     </w:p>
+    <w:p/>
+    <w:p/>
+    <w:p/>
+    <w:p/>
+    <w:p/>
     <w:p>
       <w:pPr>
         <w:spacing w:before="160" w:after="40"/>
@@ -2360,7 +2176,7 @@
           <w:u w:val="none"/>
           <w:highlight w:val="yellow"/>
         </w:rPr>
-        <w:t>by / its</w:t>
+        <w:t>congestion / bicycle</w:t>
       </w:r>
     </w:p>
     <w:p>
@@ -2435,7 +2251,7 @@
           <w:u w:val="none"/>
           <w:highlight w:val="yellow"/>
         </w:rPr>
-        <w:t>people / by</w:t>
+        <w:t>commute / bicycle</w:t>
       </w:r>
     </w:p>
     <w:p>
@@ -2510,7 +2326,7 @@
           <w:u w:val="none"/>
           <w:highlight w:val="yellow"/>
         </w:rPr>
-        <w:t>for / it</w:t>
+        <w:t>for / considered</w:t>
       </w:r>
     </w:p>
     <w:p>
@@ -2585,7 +2401,7 @@
           <w:u w:val="none"/>
           <w:highlight w:val="yellow"/>
         </w:rPr>
-        <w:t>adopt / favor</w:t>
+        <w:t>adopt / cyclists</w:t>
       </w:r>
     </w:p>
     <w:p>
@@ -2660,7 +2476,7 @@
           <w:u w:val="none"/>
           <w:highlight w:val="yellow"/>
         </w:rPr>
-        <w:t>a / should</w:t>
+        <w:t>model / should</w:t>
       </w:r>
     </w:p>
     <w:p>

</xml_diff>

<commit_message>
Add separate 大問5 英文解釈 file; replace 大問7 with Shakespeare passage
- New script make_exam_q5_eibun.py: 大問5 英文解釈 as standalone Word doc
  - Part 1: SVOCM + 日本語訳 for 4 sentences (入門 33,34,37,38,41)
  - Part 2: 4 構文解釈 正誤問題 (ア/イ), answer key 5ア 6イ 7ア 8イ
  - AlphaGo sentence includes sub-question: 何がショックだったの？
- Main exam: replace Faces/Emojis 大問7 with Shakespeare and the English
  Language (英検2級 level, 5 comprehension questions, 15点)
- Main exam: replace emoticons 大問6 with pending placeholder

https://claude.ai/code/session_015DW3MeoTGzyTVFtzJFvLng
</commit_message>
<xml_diff>
--- a/output/exam_comm2_final.docx
+++ b/output/exam_comm2_final.docx
@@ -1371,7 +1371,7 @@
           <w:sz w:val="21"/>
           <w:u w:val="none"/>
         </w:rPr>
-        <w:t xml:space="preserve">　Choose the best word for each blank from options ア to オ.</w:t>
+        <w:t xml:space="preserve">　（保留）</w:t>
       </w:r>
       <w:r>
         <w:rPr>
@@ -1381,61 +1381,28 @@
           <w:sz w:val="21"/>
           <w:u w:val="none"/>
         </w:rPr>
-        <w:t>（１０点）</w:t>
+        <w:t>（　点）</w:t>
       </w:r>
     </w:p>
     <w:p>
       <w:pPr>
-        <w:spacing w:before="40" w:after="40"/>
-        <w:ind w:left="0" w:firstLine="0"/>
-        <w:jc w:val="both"/>
-      </w:pPr>
-      <w:r>
-        <w:rPr>
-          <w:rFonts w:eastAsia="MS Mincho" w:ascii="Times New Roman" w:hAnsi="Times New Roman"/>
-          <w:b w:val="0"/>
-          <w:i w:val="0"/>
-          <w:sz w:val="21"/>
-          <w:u w:val="none"/>
-        </w:rPr>
-        <w:t>Emoticons are symbols that people around the world use to ( 1 ) their feelings in digital messages. In East Asian countries such as Japan and South Korea, horizontal emoticons like (^_^) are ( 2 ) used. These focus on the eyes. People in Western countries, on the other hand, tend to use vertical emoticons like :-). These focus on the mouth. Researchers say that this difference ( 3 ) how people in different cultures read emotions from faces. East Asians focus more on the eyes when interpreting emotions, while Westerners pay more ( 4 ) to the mouth. As digital communication becomes more ( 5 ), understanding these cultural differences can help people from different countries communicate more effectively.</w:t>
-      </w:r>
-    </w:p>
-    <w:p>
-      <w:pPr>
-        <w:spacing w:before="40" w:after="40"/>
-        <w:ind w:left="0" w:firstLine="0"/>
-        <w:jc w:val="center"/>
-      </w:pPr>
-      <w:r>
-        <w:rPr>
-          <w:rFonts w:eastAsia="MS Mincho" w:ascii="Times New Roman" w:hAnsi="Times New Roman"/>
-          <w:b w:val="0"/>
-          <w:i w:val="0"/>
-          <w:sz w:val="21"/>
-          <w:u w:val="none"/>
-        </w:rPr>
-        <w:t>ア widespread　　イ commonly　　ウ express　　エ reflects　　オ attention</w:t>
-      </w:r>
-    </w:p>
-    <w:p>
-      <w:pPr>
-        <w:spacing w:before="40" w:after="120"/>
-        <w:ind w:left="0" w:firstLine="0"/>
-        <w:jc w:val="center"/>
+        <w:spacing w:before="80" w:after="80"/>
+        <w:ind w:left="283" w:firstLine="0"/>
       </w:pPr>
       <w:r>
         <w:rPr>
           <w:rFonts w:eastAsia="MS Mincho" w:ascii="Times New Roman" w:hAnsi="Times New Roman"/>
           <w:b/>
           <w:i w:val="0"/>
-          <w:sz w:val="21"/>
+          <w:sz w:val="24"/>
           <w:u w:val="none"/>
-          <w:highlight w:val="yellow"/>
         </w:rPr>
-        <w:t>１ウ　２イ　３エ　４オ　５ア</w:t>
+        <w:t>（未着手・保留）</w:t>
       </w:r>
     </w:p>
+    <w:p/>
+    <w:p/>
+    <w:p/>
     <w:p>
       <w:pPr>
         <w:spacing w:before="160" w:after="40"/>
@@ -1487,7 +1454,7 @@
           <w:sz w:val="21"/>
           <w:u w:val="none"/>
         </w:rPr>
-        <w:t>Faces, Emotions, and Emojis</w:t>
+        <w:t>Shakespeare and the English Language</w:t>
       </w:r>
     </w:p>
     <w:p>
@@ -1504,7 +1471,7 @@
           <w:sz w:val="21"/>
           <w:u w:val="none"/>
         </w:rPr>
-        <w:t xml:space="preserve">　Have you ever sent an emoji to someone in another country and gotten an unexpected reaction? The way people express and interpret emotions can vary greatly depending on cultural background.</w:t>
+        <w:t xml:space="preserve">　William Shakespeare, who lived from 1564 to 1616, is widely considered the greatest writer in the English language. His plays and poems have been translated into every major language and are performed more often than those of any other playwright. However, many people do not realize how deeply Shakespeare has influenced the way we speak English today.</w:t>
       </w:r>
     </w:p>
     <w:p>
@@ -1521,7 +1488,7 @@
           <w:sz w:val="21"/>
           <w:u w:val="none"/>
         </w:rPr>
-        <w:t xml:space="preserve">　A research team recently compared how Japanese and American participants read emotions from photographs showing various facial expressions. Participants were asked to judge how happy, sad, or surprised the people in the photos appeared. The results were striking: Japanese participants tended to focus on the eyes when judging emotions, while Americans paid more attention to the mouth. This difference in focus led to different interpretations of the very same facial expressions.</w:t>
+        <w:t xml:space="preserve">　During Shakespeare's time, the English language was going through a period of rapid change known as Early Modern English. New words were being created at an extraordinary rate to describe new ideas, places, and inventions. Shakespeare himself is believed to have invented more than 1,700 words that are still used in modern English. Words such as "bedroom," "lonely," "generous," and "fashionable" all appear for the first time in Shakespeare's works.</w:t>
       </w:r>
     </w:p>
     <w:p>
@@ -1538,7 +1505,7 @@
           <w:sz w:val="21"/>
           <w:u w:val="none"/>
         </w:rPr>
-        <w:t xml:space="preserve">　These findings help explain why emoticons differ across cultures. East Asian emoticons like (^_^) and (T_T) focus on the eyes, while Western ones like :-) and :-( focus on the mouth. Each style reflects the way people in those cultures naturally read emotions from faces.</w:t>
+        <w:t xml:space="preserve">　Shakespeare also contributed many phrases that remain common expressions today. When someone says "break the ice" to describe starting a conversation with a stranger, or "all that glitters is not gold" as a warning not to judge by appearances, they are quoting Shakespeare — often without knowing it.</w:t>
       </w:r>
     </w:p>
     <w:p>
@@ -1555,7 +1522,7 @@
           <w:sz w:val="21"/>
           <w:u w:val="none"/>
         </w:rPr>
-        <w:t xml:space="preserve">　Researchers suggest that these patterns develop early in life. Children learn to read emotions based on the expressions they see most often in their environment. Over time, these habits become deeply ingrained and affect how people communicate, even in digital spaces.</w:t>
+        <w:t xml:space="preserve">　Readers today sometimes struggle with Shakespeare's language because it contains archaic forms. For example, Shakespeare often used "thou" and "thee" instead of "you," and verb endings like "-eth" and "-est" are no longer part of standard English. Despite these differences, studying Shakespeare's original language can give us a unique window into how English has changed over the past 400 years.</w:t>
       </w:r>
     </w:p>
     <w:p>
@@ -1572,7 +1539,7 @@
           <w:sz w:val="21"/>
           <w:u w:val="none"/>
         </w:rPr>
-        <w:t xml:space="preserve">　Understanding cultural differences in emotional expression is becoming increasingly important in our connected world. By learning how people in other cultures express and interpret emotions, we can improve cross-cultural communication and reduce misunderstandings.</w:t>
+        <w:t xml:space="preserve">　Today, Shakespeare's influence can be felt not only in literature but also in everyday conversation. Understanding his language helps us appreciate the rich history of English and the remarkable creativity of one of its greatest contributors.</w:t>
       </w:r>
     </w:p>
     <w:p/>
@@ -1592,7 +1559,217 @@
           <w:sz w:val="21"/>
           <w:u w:val="none"/>
         </w:rPr>
-        <w:t>(1) What did the research team discover?</w:t>
+        <w:t>(1) What is one thing that surprises many people about Shakespeare?</w:t>
+      </w:r>
+      <w:r>
+        <w:rPr>
+          <w:rFonts w:eastAsia="MS Mincho" w:ascii="Times New Roman" w:hAnsi="Times New Roman"/>
+          <w:b w:val="0"/>
+          <w:i w:val="0"/>
+          <w:sz w:val="21"/>
+          <w:u w:val="none"/>
+        </w:rPr>
+        <w:tab/>
+      </w:r>
+      <w:r>
+        <w:rPr>
+          <w:rFonts w:eastAsia="MS Mincho" w:ascii="Times New Roman" w:hAnsi="Times New Roman"/>
+          <w:b/>
+          <w:i w:val="0"/>
+          <w:sz w:val="21"/>
+          <w:u w:val="none"/>
+          <w:bdr w:val="single" w:sz="4" w:space="1" w:color="auto"/>
+        </w:rPr>
+        <w:t>3</w:t>
+      </w:r>
+    </w:p>
+    <w:p>
+      <w:pPr>
+        <w:spacing w:before="0" w:after="0"/>
+        <w:ind w:left="454" w:firstLine="0"/>
+      </w:pPr>
+      <w:r>
+        <w:rPr>
+          <w:rFonts w:eastAsia="MS Mincho" w:ascii="Times New Roman" w:hAnsi="Times New Roman"/>
+          <w:b w:val="0"/>
+          <w:i w:val="0"/>
+          <w:sz w:val="21"/>
+          <w:u w:val="none"/>
+        </w:rPr>
+        <w:t xml:space="preserve">　1.　He lived in a time when there were very few books available to read.</w:t>
+      </w:r>
+    </w:p>
+    <w:p>
+      <w:pPr>
+        <w:spacing w:before="0" w:after="0"/>
+        <w:ind w:left="454" w:firstLine="0"/>
+      </w:pPr>
+      <w:r>
+        <w:rPr>
+          <w:rFonts w:eastAsia="MS Mincho" w:ascii="Times New Roman" w:hAnsi="Times New Roman"/>
+          <w:b w:val="0"/>
+          <w:i w:val="0"/>
+          <w:sz w:val="21"/>
+          <w:u w:val="none"/>
+        </w:rPr>
+        <w:t xml:space="preserve">　2.　His plays are performed less often than those of other famous playwrights.</w:t>
+      </w:r>
+    </w:p>
+    <w:p>
+      <w:pPr>
+        <w:spacing w:before="0" w:after="0"/>
+        <w:ind w:left="454" w:firstLine="0"/>
+      </w:pPr>
+      <w:r>
+        <w:rPr>
+          <w:rFonts w:eastAsia="MS Mincho" w:ascii="Times New Roman" w:hAnsi="Times New Roman"/>
+          <w:b w:val="0"/>
+          <w:i w:val="0"/>
+          <w:sz w:val="21"/>
+          <w:u w:val="none"/>
+        </w:rPr>
+        <w:t xml:space="preserve">　3.　He had a deep influence on the words and expressions we use in English today.</w:t>
+      </w:r>
+    </w:p>
+    <w:p>
+      <w:pPr>
+        <w:spacing w:before="0" w:after="0"/>
+        <w:ind w:left="454" w:firstLine="0"/>
+      </w:pPr>
+      <w:r>
+        <w:rPr>
+          <w:rFonts w:eastAsia="MS Mincho" w:ascii="Times New Roman" w:hAnsi="Times New Roman"/>
+          <w:b w:val="0"/>
+          <w:i w:val="0"/>
+          <w:sz w:val="21"/>
+          <w:u w:val="none"/>
+        </w:rPr>
+        <w:t xml:space="preserve">　4.　He translated his own works into many different languages.</w:t>
+      </w:r>
+    </w:p>
+    <w:p/>
+    <w:p>
+      <w:pPr>
+        <w:tabs>
+          <w:tab w:pos="9071" w:val="right"/>
+        </w:tabs>
+        <w:spacing w:before="60" w:after="20"/>
+        <w:ind w:left="170" w:firstLine="0"/>
+      </w:pPr>
+      <w:r>
+        <w:rPr>
+          <w:rFonts w:eastAsia="MS Mincho" w:ascii="Times New Roman" w:hAnsi="Times New Roman"/>
+          <w:b w:val="0"/>
+          <w:i w:val="0"/>
+          <w:sz w:val="21"/>
+          <w:u w:val="none"/>
+        </w:rPr>
+        <w:t>(2) Which of the following is NOT mentioned as a word invented by Shakespeare?</w:t>
+      </w:r>
+      <w:r>
+        <w:rPr>
+          <w:rFonts w:eastAsia="MS Mincho" w:ascii="Times New Roman" w:hAnsi="Times New Roman"/>
+          <w:b w:val="0"/>
+          <w:i w:val="0"/>
+          <w:sz w:val="21"/>
+          <w:u w:val="none"/>
+        </w:rPr>
+        <w:tab/>
+      </w:r>
+      <w:r>
+        <w:rPr>
+          <w:rFonts w:eastAsia="MS Mincho" w:ascii="Times New Roman" w:hAnsi="Times New Roman"/>
+          <w:b/>
+          <w:i w:val="0"/>
+          <w:sz w:val="21"/>
+          <w:u w:val="none"/>
+          <w:bdr w:val="single" w:sz="4" w:space="1" w:color="auto"/>
+        </w:rPr>
+        <w:t>4</w:t>
+      </w:r>
+    </w:p>
+    <w:p>
+      <w:pPr>
+        <w:spacing w:before="0" w:after="0"/>
+        <w:ind w:left="454" w:firstLine="0"/>
+      </w:pPr>
+      <w:r>
+        <w:rPr>
+          <w:rFonts w:eastAsia="MS Mincho" w:ascii="Times New Roman" w:hAnsi="Times New Roman"/>
+          <w:b w:val="0"/>
+          <w:i w:val="0"/>
+          <w:sz w:val="21"/>
+          <w:u w:val="none"/>
+        </w:rPr>
+        <w:t xml:space="preserve">　1.　bedroom</w:t>
+      </w:r>
+    </w:p>
+    <w:p>
+      <w:pPr>
+        <w:spacing w:before="0" w:after="0"/>
+        <w:ind w:left="454" w:firstLine="0"/>
+      </w:pPr>
+      <w:r>
+        <w:rPr>
+          <w:rFonts w:eastAsia="MS Mincho" w:ascii="Times New Roman" w:hAnsi="Times New Roman"/>
+          <w:b w:val="0"/>
+          <w:i w:val="0"/>
+          <w:sz w:val="21"/>
+          <w:u w:val="none"/>
+        </w:rPr>
+        <w:t xml:space="preserve">　2.　fashionable</w:t>
+      </w:r>
+    </w:p>
+    <w:p>
+      <w:pPr>
+        <w:spacing w:before="0" w:after="0"/>
+        <w:ind w:left="454" w:firstLine="0"/>
+      </w:pPr>
+      <w:r>
+        <w:rPr>
+          <w:rFonts w:eastAsia="MS Mincho" w:ascii="Times New Roman" w:hAnsi="Times New Roman"/>
+          <w:b w:val="0"/>
+          <w:i w:val="0"/>
+          <w:sz w:val="21"/>
+          <w:u w:val="none"/>
+        </w:rPr>
+        <w:t xml:space="preserve">　3.　generous</w:t>
+      </w:r>
+    </w:p>
+    <w:p>
+      <w:pPr>
+        <w:spacing w:before="0" w:after="0"/>
+        <w:ind w:left="454" w:firstLine="0"/>
+      </w:pPr>
+      <w:r>
+        <w:rPr>
+          <w:rFonts w:eastAsia="MS Mincho" w:ascii="Times New Roman" w:hAnsi="Times New Roman"/>
+          <w:b w:val="0"/>
+          <w:i w:val="0"/>
+          <w:sz w:val="21"/>
+          <w:u w:val="none"/>
+        </w:rPr>
+        <w:t xml:space="preserve">　4.　extraordinary</w:t>
+      </w:r>
+    </w:p>
+    <w:p/>
+    <w:p>
+      <w:pPr>
+        <w:tabs>
+          <w:tab w:pos="9071" w:val="right"/>
+        </w:tabs>
+        <w:spacing w:before="60" w:after="20"/>
+        <w:ind w:left="170" w:firstLine="0"/>
+      </w:pPr>
+      <w:r>
+        <w:rPr>
+          <w:rFonts w:eastAsia="MS Mincho" w:ascii="Times New Roman" w:hAnsi="Times New Roman"/>
+          <w:b w:val="0"/>
+          <w:i w:val="0"/>
+          <w:sz w:val="21"/>
+          <w:u w:val="none"/>
+        </w:rPr>
+        <w:t>(3) What does "break the ice" mean, according to the passage?</w:t>
       </w:r>
       <w:r>
         <w:rPr>
@@ -1629,7 +1806,7 @@
           <w:sz w:val="21"/>
           <w:u w:val="none"/>
         </w:rPr>
-        <w:t xml:space="preserve">　1.　Japanese people are naturally better at reading emotions than Americans.</w:t>
+        <w:t xml:space="preserve">　1.　To physically break something frozen in cold weather.</w:t>
       </w:r>
     </w:p>
     <w:p>
@@ -1645,7 +1822,7 @@
           <w:sz w:val="21"/>
           <w:u w:val="none"/>
         </w:rPr>
-        <w:t xml:space="preserve">　2.　People from different cultures focused on different parts of the face when reading emotions.</w:t>
+        <w:t xml:space="preserve">　2.　To start a conversation with someone you do not know well.</w:t>
       </w:r>
     </w:p>
     <w:p>
@@ -1661,7 +1838,7 @@
           <w:sz w:val="21"/>
           <w:u w:val="none"/>
         </w:rPr>
-        <w:t xml:space="preserve">　3.　American participants found facial expressions in photographs more difficult to interpret.</w:t>
+        <w:t xml:space="preserve">　3.　To perform a scene from a Shakespeare play on stage.</w:t>
       </w:r>
     </w:p>
     <w:p>
@@ -1677,7 +1854,7 @@
           <w:sz w:val="21"/>
           <w:u w:val="none"/>
         </w:rPr>
-        <w:t xml:space="preserve">　4.　Photography is the most effective tool for studying human emotions.</w:t>
+        <w:t xml:space="preserve">　4.　To warn others not to make hasty judgments.</w:t>
       </w:r>
     </w:p>
     <w:p/>
@@ -1697,112 +1874,7 @@
           <w:sz w:val="21"/>
           <w:u w:val="none"/>
         </w:rPr>
-        <w:t>(2) How are East Asian emoticons different from Western ones?</w:t>
-      </w:r>
-      <w:r>
-        <w:rPr>
-          <w:rFonts w:eastAsia="MS Mincho" w:ascii="Times New Roman" w:hAnsi="Times New Roman"/>
-          <w:b w:val="0"/>
-          <w:i w:val="0"/>
-          <w:sz w:val="21"/>
-          <w:u w:val="none"/>
-        </w:rPr>
-        <w:tab/>
-      </w:r>
-      <w:r>
-        <w:rPr>
-          <w:rFonts w:eastAsia="MS Mincho" w:ascii="Times New Roman" w:hAnsi="Times New Roman"/>
-          <w:b/>
-          <w:i w:val="0"/>
-          <w:sz w:val="21"/>
-          <w:u w:val="none"/>
-          <w:bdr w:val="single" w:sz="4" w:space="1" w:color="auto"/>
-        </w:rPr>
-        <w:t>2</w:t>
-      </w:r>
-    </w:p>
-    <w:p>
-      <w:pPr>
-        <w:spacing w:before="0" w:after="0"/>
-        <w:ind w:left="454" w:firstLine="0"/>
-      </w:pPr>
-      <w:r>
-        <w:rPr>
-          <w:rFonts w:eastAsia="MS Mincho" w:ascii="Times New Roman" w:hAnsi="Times New Roman"/>
-          <w:b w:val="0"/>
-          <w:i w:val="0"/>
-          <w:sz w:val="21"/>
-          <w:u w:val="none"/>
-        </w:rPr>
-        <w:t xml:space="preserve">　1.　East Asian emoticons use more keyboard symbols and special characters.</w:t>
-      </w:r>
-    </w:p>
-    <w:p>
-      <w:pPr>
-        <w:spacing w:before="0" w:after="0"/>
-        <w:ind w:left="454" w:firstLine="0"/>
-      </w:pPr>
-      <w:r>
-        <w:rPr>
-          <w:rFonts w:eastAsia="MS Mincho" w:ascii="Times New Roman" w:hAnsi="Times New Roman"/>
-          <w:b w:val="0"/>
-          <w:i w:val="0"/>
-          <w:sz w:val="21"/>
-          <w:u w:val="none"/>
-        </w:rPr>
-        <w:t xml:space="preserve">　2.　East Asian emoticons focus on the eyes, while Western emoticons focus on the mouth.</w:t>
-      </w:r>
-    </w:p>
-    <w:p>
-      <w:pPr>
-        <w:spacing w:before="0" w:after="0"/>
-        <w:ind w:left="454" w:firstLine="0"/>
-      </w:pPr>
-      <w:r>
-        <w:rPr>
-          <w:rFonts w:eastAsia="MS Mincho" w:ascii="Times New Roman" w:hAnsi="Times New Roman"/>
-          <w:b w:val="0"/>
-          <w:i w:val="0"/>
-          <w:sz w:val="21"/>
-          <w:u w:val="none"/>
-        </w:rPr>
-        <w:t xml:space="preserve">　3.　East Asian emoticons are more commonly used in business communication.</w:t>
-      </w:r>
-    </w:p>
-    <w:p>
-      <w:pPr>
-        <w:spacing w:before="0" w:after="0"/>
-        <w:ind w:left="454" w:firstLine="0"/>
-      </w:pPr>
-      <w:r>
-        <w:rPr>
-          <w:rFonts w:eastAsia="MS Mincho" w:ascii="Times New Roman" w:hAnsi="Times New Roman"/>
-          <w:b w:val="0"/>
-          <w:i w:val="0"/>
-          <w:sz w:val="21"/>
-          <w:u w:val="none"/>
-        </w:rPr>
-        <w:t xml:space="preserve">　4.　East Asian emoticons were invented earlier than Western emoticons.</w:t>
-      </w:r>
-    </w:p>
-    <w:p/>
-    <w:p>
-      <w:pPr>
-        <w:tabs>
-          <w:tab w:pos="9071" w:val="right"/>
-        </w:tabs>
-        <w:spacing w:before="60" w:after="20"/>
-        <w:ind w:left="170" w:firstLine="0"/>
-      </w:pPr>
-      <w:r>
-        <w:rPr>
-          <w:rFonts w:eastAsia="MS Mincho" w:ascii="Times New Roman" w:hAnsi="Times New Roman"/>
-          <w:b w:val="0"/>
-          <w:i w:val="0"/>
-          <w:sz w:val="21"/>
-          <w:u w:val="none"/>
-        </w:rPr>
-        <w:t>(3) How do people develop different patterns for reading emotions?</w:t>
+        <w:t>(4) Why do modern readers sometimes find Shakespeare's language difficult?</w:t>
       </w:r>
       <w:r>
         <w:rPr>
@@ -1839,7 +1911,7 @@
           <w:sz w:val="21"/>
           <w:u w:val="none"/>
         </w:rPr>
-        <w:t xml:space="preserve">　1.　They take special courses on emotional intelligence at school.</w:t>
+        <w:t xml:space="preserve">　1.　His plays contain words that cannot be found in any dictionary.</w:t>
       </w:r>
     </w:p>
     <w:p>
@@ -1855,7 +1927,7 @@
           <w:sz w:val="21"/>
           <w:u w:val="none"/>
         </w:rPr>
-        <w:t xml:space="preserve">　2.　They are directly taught specific techniques by their parents.</w:t>
+        <w:t xml:space="preserve">　2.　The plots of his plays are too complicated to follow.</w:t>
       </w:r>
     </w:p>
     <w:p>
@@ -1871,7 +1943,7 @@
           <w:sz w:val="21"/>
           <w:u w:val="none"/>
         </w:rPr>
-        <w:t xml:space="preserve">　3.　They learn from the facial expressions they see most often in daily life.</w:t>
+        <w:t xml:space="preserve">　3.　He used old-fashioned pronouns and verb endings no longer used today.</w:t>
       </w:r>
     </w:p>
     <w:p>
@@ -1887,7 +1959,7 @@
           <w:sz w:val="21"/>
           <w:u w:val="none"/>
         </w:rPr>
-        <w:t xml:space="preserve">　4.　They study photographs and digital media from a young age.</w:t>
+        <w:t xml:space="preserve">　4.　His works were written in a completely different language.</w:t>
       </w:r>
     </w:p>
     <w:p/>
@@ -1907,112 +1979,7 @@
           <w:sz w:val="21"/>
           <w:u w:val="none"/>
         </w:rPr>
-        <w:t>(4) What does the writer suggest is important in today's world?</w:t>
-      </w:r>
-      <w:r>
-        <w:rPr>
-          <w:rFonts w:eastAsia="MS Mincho" w:ascii="Times New Roman" w:hAnsi="Times New Roman"/>
-          <w:b w:val="0"/>
-          <w:i w:val="0"/>
-          <w:sz w:val="21"/>
-          <w:u w:val="none"/>
-        </w:rPr>
-        <w:tab/>
-      </w:r>
-      <w:r>
-        <w:rPr>
-          <w:rFonts w:eastAsia="MS Mincho" w:ascii="Times New Roman" w:hAnsi="Times New Roman"/>
-          <w:b/>
-          <w:i w:val="0"/>
-          <w:sz w:val="21"/>
-          <w:u w:val="none"/>
-          <w:bdr w:val="single" w:sz="4" w:space="1" w:color="auto"/>
-        </w:rPr>
-        <w:t>2</w:t>
-      </w:r>
-    </w:p>
-    <w:p>
-      <w:pPr>
-        <w:spacing w:before="0" w:after="0"/>
-        <w:ind w:left="454" w:firstLine="0"/>
-      </w:pPr>
-      <w:r>
-        <w:rPr>
-          <w:rFonts w:eastAsia="MS Mincho" w:ascii="Times New Roman" w:hAnsi="Times New Roman"/>
-          <w:b w:val="0"/>
-          <w:i w:val="0"/>
-          <w:sz w:val="21"/>
-          <w:u w:val="none"/>
-        </w:rPr>
-        <w:t xml:space="preserve">　1.　Avoiding emoticons in any kind of professional or international communication.</w:t>
-      </w:r>
-    </w:p>
-    <w:p>
-      <w:pPr>
-        <w:spacing w:before="0" w:after="0"/>
-        <w:ind w:left="454" w:firstLine="0"/>
-      </w:pPr>
-      <w:r>
-        <w:rPr>
-          <w:rFonts w:eastAsia="MS Mincho" w:ascii="Times New Roman" w:hAnsi="Times New Roman"/>
-          <w:b w:val="0"/>
-          <w:i w:val="0"/>
-          <w:sz w:val="21"/>
-          <w:u w:val="none"/>
-        </w:rPr>
-        <w:t xml:space="preserve">　2.　Understanding how people in other cultures express and interpret emotions.</w:t>
-      </w:r>
-    </w:p>
-    <w:p>
-      <w:pPr>
-        <w:spacing w:before="0" w:after="0"/>
-        <w:ind w:left="454" w:firstLine="0"/>
-      </w:pPr>
-      <w:r>
-        <w:rPr>
-          <w:rFonts w:eastAsia="MS Mincho" w:ascii="Times New Roman" w:hAnsi="Times New Roman"/>
-          <w:b w:val="0"/>
-          <w:i w:val="0"/>
-          <w:sz w:val="21"/>
-          <w:u w:val="none"/>
-        </w:rPr>
-        <w:t xml:space="preserve">　3.　Using only the emoticons that are popular in your own country.</w:t>
-      </w:r>
-    </w:p>
-    <w:p>
-      <w:pPr>
-        <w:spacing w:before="0" w:after="0"/>
-        <w:ind w:left="454" w:firstLine="0"/>
-      </w:pPr>
-      <w:r>
-        <w:rPr>
-          <w:rFonts w:eastAsia="MS Mincho" w:ascii="Times New Roman" w:hAnsi="Times New Roman"/>
-          <w:b w:val="0"/>
-          <w:i w:val="0"/>
-          <w:sz w:val="21"/>
-          <w:u w:val="none"/>
-        </w:rPr>
-        <w:t xml:space="preserve">　4.　Ensuring that children learn multiple languages from an early age.</w:t>
-      </w:r>
-    </w:p>
-    <w:p/>
-    <w:p>
-      <w:pPr>
-        <w:tabs>
-          <w:tab w:pos="9071" w:val="right"/>
-        </w:tabs>
-        <w:spacing w:before="60" w:after="20"/>
-        <w:ind w:left="170" w:firstLine="0"/>
-      </w:pPr>
-      <w:r>
-        <w:rPr>
-          <w:rFonts w:eastAsia="MS Mincho" w:ascii="Times New Roman" w:hAnsi="Times New Roman"/>
-          <w:b w:val="0"/>
-          <w:i w:val="0"/>
-          <w:sz w:val="21"/>
-          <w:u w:val="none"/>
-        </w:rPr>
-        <w:t>(5) Which statement best matches the main idea of the passage?</w:t>
+        <w:t>(5) What is the main idea of this passage?</w:t>
       </w:r>
       <w:r>
         <w:rPr>
@@ -2049,7 +2016,7 @@
           <w:sz w:val="21"/>
           <w:u w:val="none"/>
         </w:rPr>
-        <w:t xml:space="preserve">　1.　East Asian countries produce far more emoticons than Western countries.</w:t>
+        <w:t xml:space="preserve">　1.　Shakespeare's plays are the most widely performed in the world.</w:t>
       </w:r>
     </w:p>
     <w:p>
@@ -2065,7 +2032,7 @@
           <w:sz w:val="21"/>
           <w:u w:val="none"/>
         </w:rPr>
-        <w:t xml:space="preserve">　2.　Research has shown that American communication styles are more effective globally.</w:t>
+        <w:t xml:space="preserve">　2.　Early Modern English was very different from the English spoken today.</w:t>
       </w:r>
     </w:p>
     <w:p>
@@ -2081,7 +2048,7 @@
           <w:sz w:val="21"/>
           <w:u w:val="none"/>
         </w:rPr>
-        <w:t xml:space="preserve">　3.　Cultural differences in how people read emotions are reflected in emoticons and affect cross-cultural communication.</w:t>
+        <w:t xml:space="preserve">　3.　Shakespeare made lasting contributions to the English language that continue to influence us.</w:t>
       </w:r>
     </w:p>
     <w:p>
@@ -2097,7 +2064,7 @@
           <w:sz w:val="21"/>
           <w:u w:val="none"/>
         </w:rPr>
-        <w:t xml:space="preserve">　4.　Children around the world learn to express emotions in fundamentally the same way.</w:t>
+        <w:t xml:space="preserve">　4.　Studying old literature is the best way to improve your English skills.</w:t>
       </w:r>
     </w:p>
     <w:p/>

</xml_diff>

<commit_message>
Add 大問3 (L4 emoticons) and 大問4 (L3 Copenhagenization) from textbook
大問3: Lesson 4 Part 4 passage (experiment in Japan/Cameroon/Tanzania)
- Options: ア recognize イ baffle ウ conduct エ rate (all base form)
- Answers: 1ウ 2エ 3ア 4イ

大問4: Lesson 3 Part 4 (Copenhagenization) word insertion
- Removed words: 0.once(example) 1.so that 2.such as 3.quicker 4.instead of 5.well
- Textbook text used verbatim; answers verified against surrounding words

https://claude.ai/code/session_015DW3MeoTGzyTVFtzJFvLng
</commit_message>
<xml_diff>
--- a/output/exam_comm2_final.docx
+++ b/output/exam_comm2_final.docx
@@ -1195,7 +1195,7 @@
           <w:sz w:val="21"/>
           <w:u w:val="none"/>
         </w:rPr>
-        <w:t>ア span　　　イ prevent　　　ウ serve　　　エ connect</w:t>
+        <w:t>ア recognize　　　イ baffle　　　ウ conduct　　　エ rate</w:t>
       </w:r>
     </w:p>
     <w:p>
@@ -1212,7 +1212,7 @@
           <w:sz w:val="21"/>
           <w:u w:val="none"/>
         </w:rPr>
-        <w:t>There is also a bicycle bridge （　1　）ning the city center called the Bicycle Snake. This bridge （　2　）s as a shortcut for cyclists and offers a striking view of the waterfront. Its gentle curves （　3　） anyone from going too fast, so everyone can cruise safely. For longer journeys, many Cycle Superhighways （　4　） Copenhagen with surrounding communities, providing pleasant routes through forests and countryside.</w:t>
+        <w:t>Lastly, people need to have seen some emoticons before they can understand their meanings. An experiment was （　1　）ed in Japan, Cameroon, and Tanzania. The participants were asked to （　2　） three different styles of emoticons by using a 'sadness-happiness' scale. The Japanese participants easily （　3　）d the emotions in the emoticons. On the other hand, the participants in Cameroon and Tanzania hardly understood them. They were utterly （　4　）d by what the shape of each emoticon indicated. In other words, emoticons do not look like facial expressions to everyone.</w:t>
       </w:r>
     </w:p>
     <w:p>
@@ -1230,7 +1230,7 @@
           <w:u w:val="none"/>
           <w:highlight w:val="yellow"/>
         </w:rPr>
-        <w:t>１ア　２ウ　３イ　４エ</w:t>
+        <w:t>１ウ　２エ　３ア　４イ</w:t>
       </w:r>
     </w:p>
     <w:p>
@@ -1270,27 +1270,211 @@
         <w:t>（１０点）</w:t>
       </w:r>
     </w:p>
+    <w:tbl>
+      <w:tblPr>
+        <w:tblStyle w:val="TableGrid"/>
+        <w:tblW w:type="auto" w:w="0"/>
+        <w:tblLook w:firstColumn="1" w:firstRow="1" w:lastColumn="0" w:lastRow="0" w:noHBand="0" w:noVBand="1" w:val="04A0"/>
+      </w:tblPr>
+      <w:tblGrid>
+        <w:gridCol w:w="1512"/>
+        <w:gridCol w:w="1512"/>
+        <w:gridCol w:w="1512"/>
+        <w:gridCol w:w="1512"/>
+        <w:gridCol w:w="1512"/>
+        <w:gridCol w:w="1512"/>
+      </w:tblGrid>
+      <w:tr>
+        <w:tc>
+          <w:tcPr>
+            <w:tcW w:type="dxa" w:w="1512"/>
+          </w:tcPr>
+          <w:p>
+            <w:pPr>
+              <w:jc w:val="center"/>
+            </w:pPr>
+            <w:r>
+              <w:rPr>
+                <w:rFonts w:eastAsia="MS Mincho" w:ascii="Times New Roman" w:hAnsi="Times New Roman"/>
+                <w:b w:val="0"/>
+                <w:i w:val="0"/>
+                <w:sz w:val="20"/>
+                <w:u w:val="none"/>
+              </w:rPr>
+              <w:t>0. once</w:t>
+            </w:r>
+          </w:p>
+        </w:tc>
+        <w:tc>
+          <w:tcPr>
+            <w:tcW w:type="dxa" w:w="1512"/>
+          </w:tcPr>
+          <w:p>
+            <w:pPr>
+              <w:jc w:val="center"/>
+            </w:pPr>
+            <w:r>
+              <w:rPr>
+                <w:rFonts w:eastAsia="MS Mincho" w:ascii="Times New Roman" w:hAnsi="Times New Roman"/>
+                <w:b w:val="0"/>
+                <w:i w:val="0"/>
+                <w:sz w:val="20"/>
+                <w:u w:val="none"/>
+              </w:rPr>
+              <w:t>1. so that</w:t>
+            </w:r>
+          </w:p>
+        </w:tc>
+        <w:tc>
+          <w:tcPr>
+            <w:tcW w:type="dxa" w:w="1512"/>
+          </w:tcPr>
+          <w:p>
+            <w:pPr>
+              <w:jc w:val="center"/>
+            </w:pPr>
+            <w:r>
+              <w:rPr>
+                <w:rFonts w:eastAsia="MS Mincho" w:ascii="Times New Roman" w:hAnsi="Times New Roman"/>
+                <w:b w:val="0"/>
+                <w:i w:val="0"/>
+                <w:sz w:val="20"/>
+                <w:u w:val="none"/>
+              </w:rPr>
+              <w:t>2. such as</w:t>
+            </w:r>
+          </w:p>
+        </w:tc>
+        <w:tc>
+          <w:tcPr>
+            <w:tcW w:type="dxa" w:w="1512"/>
+          </w:tcPr>
+          <w:p>
+            <w:pPr>
+              <w:jc w:val="center"/>
+            </w:pPr>
+            <w:r>
+              <w:rPr>
+                <w:rFonts w:eastAsia="MS Mincho" w:ascii="Times New Roman" w:hAnsi="Times New Roman"/>
+                <w:b w:val="0"/>
+                <w:i w:val="0"/>
+                <w:sz w:val="20"/>
+                <w:u w:val="none"/>
+              </w:rPr>
+              <w:t>3. quicker</w:t>
+            </w:r>
+          </w:p>
+        </w:tc>
+        <w:tc>
+          <w:tcPr>
+            <w:tcW w:type="dxa" w:w="1512"/>
+          </w:tcPr>
+          <w:p>
+            <w:pPr>
+              <w:jc w:val="center"/>
+            </w:pPr>
+            <w:r>
+              <w:rPr>
+                <w:rFonts w:eastAsia="MS Mincho" w:ascii="Times New Roman" w:hAnsi="Times New Roman"/>
+                <w:b w:val="0"/>
+                <w:i w:val="0"/>
+                <w:sz w:val="20"/>
+                <w:u w:val="none"/>
+              </w:rPr>
+              <w:t>4. instead of</w:t>
+            </w:r>
+          </w:p>
+        </w:tc>
+        <w:tc>
+          <w:tcPr>
+            <w:tcW w:type="dxa" w:w="1512"/>
+          </w:tcPr>
+          <w:p>
+            <w:pPr>
+              <w:jc w:val="center"/>
+            </w:pPr>
+            <w:r>
+              <w:rPr>
+                <w:rFonts w:eastAsia="MS Mincho" w:ascii="Times New Roman" w:hAnsi="Times New Roman"/>
+                <w:b w:val="0"/>
+                <w:i w:val="0"/>
+                <w:sz w:val="20"/>
+                <w:u w:val="none"/>
+              </w:rPr>
+              <w:t>5. well</w:t>
+            </w:r>
+          </w:p>
+        </w:tc>
+      </w:tr>
+    </w:tbl>
+    <w:p/>
     <w:p>
       <w:pPr>
-        <w:spacing w:before="80" w:after="80"/>
-        <w:ind w:left="283" w:firstLine="0"/>
+        <w:spacing w:before="0" w:after="40"/>
+        <w:ind w:left="170" w:firstLine="0"/>
+      </w:pPr>
+      <w:r>
+        <w:rPr>
+          <w:rFonts w:eastAsia="MS Mincho" w:ascii="Times New Roman" w:hAnsi="Times New Roman"/>
+          <w:b w:val="0"/>
+          <w:i w:val="0"/>
+          <w:sz w:val="21"/>
+          <w:u w:val="none"/>
+        </w:rPr>
+        <w:t>解答例　　（ planners ） once （ used ）</w:t>
+      </w:r>
+    </w:p>
+    <w:p>
+      <w:pPr>
+        <w:spacing w:before="40" w:after="0"/>
+        <w:ind w:left="0" w:firstLine="0"/>
+        <w:jc w:val="both"/>
+      </w:pPr>
+      <w:r>
+        <w:rPr>
+          <w:rFonts w:eastAsia="MS Mincho" w:ascii="Times New Roman" w:hAnsi="Times New Roman"/>
+          <w:b w:val="0"/>
+          <w:i w:val="0"/>
+          <w:sz w:val="21"/>
+          <w:u w:val="none"/>
+        </w:rPr>
+        <w:t>Surprisingly, Copenhagen's urban planners used to favor cars over other forms of transportation. The oil crisis of the 1970s led them to revise their transportation systems they would not have to rely on oil. Since then, the city has been installing cycling infrastructure the Green Wave and the Bicycle Snake. As a result, it is now to go downtown by bicycle than by car. That has led more people to cycle driving.</w:t>
+      </w:r>
+    </w:p>
+    <w:p>
+      <w:pPr>
+        <w:spacing w:before="0" w:after="80"/>
+        <w:ind w:left="0" w:firstLine="0"/>
+        <w:jc w:val="both"/>
+      </w:pPr>
+      <w:r>
+        <w:rPr>
+          <w:rFonts w:eastAsia="MS Mincho" w:ascii="Times New Roman" w:hAnsi="Times New Roman"/>
+          <w:b w:val="0"/>
+          <w:i w:val="0"/>
+          <w:sz w:val="21"/>
+          <w:u w:val="none"/>
+        </w:rPr>
+        <w:t>Making cities healthier and more attractive by adopting bike-friendly policies has come to be known as "Copenhagenization." Even New York is following Copenhagen's example. It has started locating car parking spaces in the middle of the street. That approach is called the "Protected Bicycle Lane" policy and it prevents vehicles from entering or parking in the bike lane. Consequently, bicycle traffic has increased 1.6 times. Moreover, there are fewer accidents. Many other cities may "Copenhagenize" as they seek to build more sustainable, livable communities. The Copenhagen model is changing the world for the better.</w:t>
+      </w:r>
+    </w:p>
+    <w:p>
+      <w:pPr>
+        <w:spacing w:before="40" w:after="120"/>
+        <w:ind w:left="170" w:firstLine="0"/>
       </w:pPr>
       <w:r>
         <w:rPr>
           <w:rFonts w:eastAsia="MS Mincho" w:ascii="Times New Roman" w:hAnsi="Times New Roman"/>
           <w:b/>
           <w:i w:val="0"/>
-          <w:sz w:val="24"/>
+          <w:sz w:val="19"/>
           <w:u w:val="none"/>
+          <w:highlight w:val="yellow"/>
         </w:rPr>
-        <w:t>（教科書原文との照合が必要：未着手）</w:t>
+        <w:t>1.（systems）so that（they）　　2.（infrastructure）such as（the）　　3.（now）quicker（to）　　4.（cycle）instead of（driving）　　5.（may）well（"Copenhagenize"）</w:t>
       </w:r>
     </w:p>
-    <w:p/>
-    <w:p/>
-    <w:p/>
-    <w:p/>
-    <w:p/>
     <w:p>
       <w:pPr>
         <w:spacing w:before="160" w:after="40"/>

</xml_diff>

<commit_message>
output: 全大問一括版 exam_comm2_final.docx を更新
</commit_message>
<xml_diff>
--- a/output/exam_comm2_final.docx
+++ b/output/exam_comm2_final.docx
@@ -1499,7 +1499,7 @@
           <w:sz w:val="21"/>
           <w:u w:val="none"/>
         </w:rPr>
-        <w:t xml:space="preserve">　以下の英文解釈に関する問題に答えなさい</w:t>
+        <w:t xml:space="preserve">　以下の英文解釈に関する問題に答えなさい。</w:t>
       </w:r>
       <w:r>
         <w:rPr>
@@ -1509,28 +1509,802 @@
           <w:sz w:val="21"/>
           <w:u w:val="none"/>
         </w:rPr>
-        <w:t>（16点）</w:t>
+        <w:t>（１６点）</w:t>
       </w:r>
     </w:p>
     <w:p>
       <w:pPr>
-        <w:spacing w:before="80" w:after="80"/>
-        <w:ind w:left="283" w:firstLine="0"/>
+        <w:spacing w:before="80" w:after="40"/>
+        <w:ind w:left="170" w:firstLine="0"/>
+      </w:pPr>
+      <w:r>
+        <w:rPr>
+          <w:rFonts w:eastAsia="MS Mincho" w:ascii="Times New Roman" w:hAnsi="Times New Roman"/>
+          <w:b w:val="0"/>
+          <w:i w:val="0"/>
+          <w:sz w:val="21"/>
+          <w:u w:val="none"/>
+        </w:rPr>
+        <w:t>下の例にならい、次の文１〜４に SVOCM の記号を振り構造を表しなさい。また、それにもとづいた英文の日本語訳を書きなさい。ただし、1 つの単語につき 2 つ以上の記号・下線は付さなくて良い。文全体の大きな構造がわかるように図示すること。</w:t>
+      </w:r>
+    </w:p>
+    <w:p>
+      <w:pPr>
+        <w:spacing w:before="40" w:after="0"/>
+        <w:ind w:left="170" w:firstLine="0"/>
       </w:pPr>
       <w:r>
         <w:rPr>
           <w:rFonts w:eastAsia="MS Mincho" w:ascii="Times New Roman" w:hAnsi="Times New Roman"/>
           <w:b/>
           <w:i w:val="0"/>
-          <w:sz w:val="24"/>
+          <w:sz w:val="18"/>
           <w:u w:val="none"/>
         </w:rPr>
-        <w:t>（空白）</w:t>
+        <w:t>例</w:t>
+      </w:r>
+    </w:p>
+    <w:p>
+      <w:pPr>
+        <w:spacing w:before="0" w:after="40"/>
+        <w:ind w:left="283" w:firstLine="0"/>
+      </w:pPr>
+      <w:r>
+        <w:rPr>
+          <w:rFonts w:eastAsia="MS Mincho" w:ascii="Times New Roman" w:hAnsi="Times New Roman"/>
+          <w:b w:val="0"/>
+          <w:i w:val="0"/>
+          <w:sz w:val="18"/>
+          <w:u w:val="none"/>
+        </w:rPr>
+        <w:t>（記号）S → 四角　、V → 下線　、O → 二重下線　、C → 波線　、M → （まるカッコ）</w:t>
+      </w:r>
+    </w:p>
+    <w:p>
+      <w:pPr>
+        <w:spacing w:before="0" w:after="120"/>
+        <w:ind w:left="283" w:firstLine="0"/>
+      </w:pPr>
+      <w:r>
+        <w:rPr>
+          <w:rFonts w:eastAsia="MS Mincho" w:ascii="Times New Roman" w:hAnsi="Times New Roman"/>
+          <w:b w:val="0"/>
+          <w:i w:val="0"/>
+          <w:sz w:val="19"/>
+          <w:u w:val="none"/>
+        </w:rPr>
+        <w:t>Developing nations were under-represented, (with competitors facing obstacles ranging from prejudice against disability to the high cost of wheelchairs).</w:t>
+      </w:r>
+    </w:p>
+    <w:p>
+      <w:pPr>
+        <w:spacing w:before="120" w:after="0"/>
+        <w:ind w:left="170" w:firstLine="0"/>
+      </w:pPr>
+      <w:r>
+        <w:rPr>
+          <w:rFonts w:eastAsia="MS Mincho" w:ascii="Times New Roman" w:hAnsi="Times New Roman"/>
+          <w:b/>
+          <w:i w:val="0"/>
+          <w:sz w:val="21"/>
+          <w:u w:val="none"/>
+        </w:rPr>
+        <w:t xml:space="preserve">　1．</w:t>
+      </w:r>
+      <w:r>
+        <w:rPr>
+          <w:rFonts w:eastAsia="MS Mincho" w:ascii="Times New Roman" w:hAnsi="Times New Roman"/>
+          <w:b w:val="0"/>
+          <w:i w:val="0"/>
+          <w:sz w:val="21"/>
+          <w:u w:val="none"/>
+        </w:rPr>
+        <w:t>She also saw the poverty of her people and the hard lives of so many women who were fighting against such basic problems as lack of food, firewood and water, and against unemployment.</w:t>
+      </w:r>
+    </w:p>
+    <w:p>
+      <w:pPr>
+        <w:spacing w:before="20" w:after="0"/>
+        <w:ind w:left="283" w:firstLine="0"/>
+      </w:pPr>
+      <w:r>
+        <w:rPr>
+          <w:rFonts w:eastAsia="MS Mincho" w:ascii="Times New Roman" w:hAnsi="Times New Roman"/>
+          <w:b w:val="0"/>
+          <w:i w:val="0"/>
+          <w:sz w:val="19"/>
+          <w:u w:val="none"/>
+        </w:rPr>
+        <w:t>（記号）</w:t>
+      </w:r>
+    </w:p>
+    <w:p>
+      <w:pPr>
+        <w:spacing w:before="0" w:after="0"/>
+        <w:ind w:left="283" w:firstLine="0"/>
+      </w:pPr>
+      <w:r>
+        <w:rPr>
+          <w:rFonts w:eastAsia="MS Mincho" w:ascii="Times New Roman" w:hAnsi="Times New Roman"/>
+          <w:b w:val="0"/>
+          <w:i w:val="0"/>
+          <w:sz w:val="19"/>
+          <w:u w:val="none"/>
+          <w:highlight w:val="yellow"/>
+        </w:rPr>
+        <w:t>S[She] V[saw] O[the poverty of her people] and O[the hard lives of so many women [who were fighting against (such basic problems as lack of food, firewood and water), and against unemployment]].</w:t>
+      </w:r>
+    </w:p>
+    <w:p>
+      <w:pPr>
+        <w:spacing w:before="40" w:after="0"/>
+        <w:ind w:left="283" w:firstLine="0"/>
+      </w:pPr>
+      <w:r>
+        <w:rPr>
+          <w:rFonts w:eastAsia="MS Mincho" w:ascii="Times New Roman" w:hAnsi="Times New Roman"/>
+          <w:b w:val="0"/>
+          <w:i w:val="0"/>
+          <w:sz w:val="19"/>
+          <w:u w:val="none"/>
+        </w:rPr>
+        <w:t>（訳）</w:t>
+      </w:r>
+    </w:p>
+    <w:p>
+      <w:pPr>
+        <w:spacing w:before="0" w:after="0"/>
+        <w:ind w:left="283" w:firstLine="0"/>
+      </w:pPr>
+      <w:r>
+        <w:rPr>
+          <w:rFonts w:eastAsia="MS Mincho" w:ascii="Times New Roman" w:hAnsi="Times New Roman"/>
+          <w:b w:val="0"/>
+          <w:i w:val="0"/>
+          <w:sz w:val="19"/>
+          <w:u w:val="none"/>
+          <w:highlight w:val="yellow"/>
+        </w:rPr>
+        <w:t>彼女はまた、自分の民の貧困と、食料・薪・水の不足や失業といった基本的な問題と闘う数多くの女性たちの苦しい生活を目の当たりにした。</w:t>
       </w:r>
     </w:p>
     <w:p/>
+    <w:p>
+      <w:pPr>
+        <w:spacing w:before="120" w:after="0"/>
+        <w:ind w:left="170" w:firstLine="0"/>
+      </w:pPr>
+      <w:r>
+        <w:rPr>
+          <w:rFonts w:eastAsia="MS Mincho" w:ascii="Times New Roman" w:hAnsi="Times New Roman"/>
+          <w:b/>
+          <w:i w:val="0"/>
+          <w:sz w:val="21"/>
+          <w:u w:val="none"/>
+        </w:rPr>
+        <w:t xml:space="preserve">　2．</w:t>
+      </w:r>
+      <w:r>
+        <w:rPr>
+          <w:rFonts w:eastAsia="MS Mincho" w:ascii="Times New Roman" w:hAnsi="Times New Roman"/>
+          <w:b w:val="0"/>
+          <w:i w:val="0"/>
+          <w:sz w:val="21"/>
+          <w:u w:val="none"/>
+        </w:rPr>
+        <w:t>In March, the AI-based computer program AlphaGo, developed by DeepMind, shocked the world when it defeated South Korean go grandmaster Lee Sedol in a five-game match of the ancient board game that requires deep insight.</w:t>
+      </w:r>
+    </w:p>
+    <w:p>
+      <w:pPr>
+        <w:spacing w:before="20" w:after="0"/>
+        <w:ind w:left="283" w:firstLine="0"/>
+      </w:pPr>
+      <w:r>
+        <w:rPr>
+          <w:rFonts w:eastAsia="MS Mincho" w:ascii="Times New Roman" w:hAnsi="Times New Roman"/>
+          <w:b w:val="0"/>
+          <w:i w:val="0"/>
+          <w:sz w:val="19"/>
+          <w:u w:val="none"/>
+        </w:rPr>
+        <w:t>（記号）</w:t>
+      </w:r>
+    </w:p>
+    <w:p>
+      <w:pPr>
+        <w:spacing w:before="0" w:after="0"/>
+        <w:ind w:left="283" w:firstLine="0"/>
+      </w:pPr>
+      <w:r>
+        <w:rPr>
+          <w:rFonts w:eastAsia="MS Mincho" w:ascii="Times New Roman" w:hAnsi="Times New Roman"/>
+          <w:b w:val="0"/>
+          <w:i w:val="0"/>
+          <w:sz w:val="19"/>
+          <w:u w:val="none"/>
+          <w:highlight w:val="yellow"/>
+        </w:rPr>
+        <w:t>M(In March), S[the AI-based computer program AlphaGo, (developed by DeepMind),] V[shocked] O[the world] M(when it defeated South Korean go grandmaster Lee Sedol in a five-game match of the ancient board game [that requires deep insight]).</w:t>
+      </w:r>
+    </w:p>
+    <w:p>
+      <w:pPr>
+        <w:spacing w:before="40" w:after="0"/>
+        <w:ind w:left="283" w:firstLine="0"/>
+      </w:pPr>
+      <w:r>
+        <w:rPr>
+          <w:rFonts w:eastAsia="MS Mincho" w:ascii="Times New Roman" w:hAnsi="Times New Roman"/>
+          <w:b w:val="0"/>
+          <w:i w:val="0"/>
+          <w:sz w:val="19"/>
+          <w:u w:val="none"/>
+        </w:rPr>
+        <w:t>（訳）</w:t>
+      </w:r>
+    </w:p>
+    <w:p>
+      <w:pPr>
+        <w:spacing w:before="0" w:after="0"/>
+        <w:ind w:left="283" w:firstLine="0"/>
+      </w:pPr>
+      <w:r>
+        <w:rPr>
+          <w:rFonts w:eastAsia="MS Mincho" w:ascii="Times New Roman" w:hAnsi="Times New Roman"/>
+          <w:b w:val="0"/>
+          <w:i w:val="0"/>
+          <w:sz w:val="19"/>
+          <w:u w:val="none"/>
+          <w:highlight w:val="yellow"/>
+        </w:rPr>
+        <w:t>3月、DeepMindが開発したAIベースのコンピュータプログラム AlphaGo は、深い洞察力を必要とするこの古代ボードゲームの5番勝負で韓国の囲碁の名人、李世乭を破り、世界に衝撃を与えた。</w:t>
+      </w:r>
+    </w:p>
+    <w:p>
+      <w:pPr>
+        <w:spacing w:before="40" w:after="0"/>
+        <w:ind w:left="283" w:firstLine="0"/>
+      </w:pPr>
+      <w:r>
+        <w:rPr>
+          <w:rFonts w:eastAsia="MS Mincho" w:ascii="Times New Roman" w:hAnsi="Times New Roman"/>
+          <w:b/>
+          <w:i w:val="0"/>
+          <w:sz w:val="19"/>
+          <w:u w:val="none"/>
+        </w:rPr>
+        <w:t>（問）</w:t>
+      </w:r>
+      <w:r>
+        <w:rPr>
+          <w:rFonts w:eastAsia="MS Mincho" w:ascii="Times New Roman" w:hAnsi="Times New Roman"/>
+          <w:b w:val="0"/>
+          <w:i w:val="0"/>
+          <w:sz w:val="19"/>
+          <w:u w:val="none"/>
+        </w:rPr>
+        <w:t>下線部が示す内容を日本語で具体的に答えなさい。</w:t>
+      </w:r>
+    </w:p>
+    <w:p>
+      <w:pPr>
+        <w:spacing w:before="0" w:after="0"/>
+        <w:ind w:left="397" w:firstLine="0"/>
+      </w:pPr>
+      <w:r>
+        <w:rPr>
+          <w:rFonts w:eastAsia="MS Mincho" w:ascii="Times New Roman" w:hAnsi="Times New Roman"/>
+          <w:b w:val="0"/>
+          <w:i w:val="0"/>
+          <w:sz w:val="19"/>
+          <w:u w:val="none"/>
+          <w:highlight w:val="yellow"/>
+        </w:rPr>
+        <w:t>AlphaGoが人間のプロ棋士（李世乭）との5番勝負に勝利したこと。</w:t>
+      </w:r>
+    </w:p>
     <w:p/>
+    <w:p>
+      <w:pPr>
+        <w:spacing w:before="120" w:after="0"/>
+        <w:ind w:left="170" w:firstLine="0"/>
+      </w:pPr>
+      <w:r>
+        <w:rPr>
+          <w:rFonts w:eastAsia="MS Mincho" w:ascii="Times New Roman" w:hAnsi="Times New Roman"/>
+          <w:b/>
+          <w:i w:val="0"/>
+          <w:sz w:val="21"/>
+          <w:u w:val="none"/>
+        </w:rPr>
+        <w:t xml:space="preserve">　3．</w:t>
+      </w:r>
+      <w:r>
+        <w:rPr>
+          <w:rFonts w:eastAsia="MS Mincho" w:ascii="Times New Roman" w:hAnsi="Times New Roman"/>
+          <w:b w:val="0"/>
+          <w:i w:val="0"/>
+          <w:sz w:val="21"/>
+          <w:u w:val="none"/>
+        </w:rPr>
+        <w:t>Although we know that the earth revolves around the sun, we cannot recite the astronomical observations and calculations that led to that conclusion.</w:t>
+      </w:r>
+    </w:p>
+    <w:p>
+      <w:pPr>
+        <w:spacing w:before="20" w:after="0"/>
+        <w:ind w:left="283" w:firstLine="0"/>
+      </w:pPr>
+      <w:r>
+        <w:rPr>
+          <w:rFonts w:eastAsia="MS Mincho" w:ascii="Times New Roman" w:hAnsi="Times New Roman"/>
+          <w:b w:val="0"/>
+          <w:i w:val="0"/>
+          <w:sz w:val="19"/>
+          <w:u w:val="none"/>
+        </w:rPr>
+        <w:t>（記号）</w:t>
+      </w:r>
+    </w:p>
+    <w:p>
+      <w:pPr>
+        <w:spacing w:before="0" w:after="0"/>
+        <w:ind w:left="283" w:firstLine="0"/>
+      </w:pPr>
+      <w:r>
+        <w:rPr>
+          <w:rFonts w:eastAsia="MS Mincho" w:ascii="Times New Roman" w:hAnsi="Times New Roman"/>
+          <w:b w:val="0"/>
+          <w:i w:val="0"/>
+          <w:sz w:val="19"/>
+          <w:u w:val="none"/>
+          <w:highlight w:val="yellow"/>
+        </w:rPr>
+        <w:t>M(Although S[we] V[know] O〈that the earth revolves around the sun〉), S[we] V[cannot recite] O[the astronomical observations and calculations [that led to that conclusion]].</w:t>
+      </w:r>
+    </w:p>
+    <w:p>
+      <w:pPr>
+        <w:spacing w:before="40" w:after="0"/>
+        <w:ind w:left="283" w:firstLine="0"/>
+      </w:pPr>
+      <w:r>
+        <w:rPr>
+          <w:rFonts w:eastAsia="MS Mincho" w:ascii="Times New Roman" w:hAnsi="Times New Roman"/>
+          <w:b w:val="0"/>
+          <w:i w:val="0"/>
+          <w:sz w:val="19"/>
+          <w:u w:val="none"/>
+        </w:rPr>
+        <w:t>（訳）</w:t>
+      </w:r>
+    </w:p>
+    <w:p>
+      <w:pPr>
+        <w:spacing w:before="0" w:after="0"/>
+        <w:ind w:left="283" w:firstLine="0"/>
+      </w:pPr>
+      <w:r>
+        <w:rPr>
+          <w:rFonts w:eastAsia="MS Mincho" w:ascii="Times New Roman" w:hAnsi="Times New Roman"/>
+          <w:b w:val="0"/>
+          <w:i w:val="0"/>
+          <w:sz w:val="19"/>
+          <w:u w:val="none"/>
+          <w:highlight w:val="yellow"/>
+        </w:rPr>
+        <w:t>地球が太陽の周りを公転していることは知っていても、私たちはその結論に至った天文学的な観測や計算を暗唱することはできない。</w:t>
+      </w:r>
+    </w:p>
     <w:p/>
+    <w:p>
+      <w:pPr>
+        <w:spacing w:before="120" w:after="0"/>
+        <w:ind w:left="170" w:firstLine="0"/>
+      </w:pPr>
+      <w:r>
+        <w:rPr>
+          <w:rFonts w:eastAsia="MS Mincho" w:ascii="Times New Roman" w:hAnsi="Times New Roman"/>
+          <w:b/>
+          <w:i w:val="0"/>
+          <w:sz w:val="21"/>
+          <w:u w:val="none"/>
+        </w:rPr>
+        <w:t xml:space="preserve">　4．</w:t>
+      </w:r>
+      <w:r>
+        <w:rPr>
+          <w:rFonts w:eastAsia="MS Mincho" w:ascii="Times New Roman" w:hAnsi="Times New Roman"/>
+          <w:b w:val="0"/>
+          <w:i w:val="0"/>
+          <w:sz w:val="21"/>
+          <w:u w:val="none"/>
+        </w:rPr>
+        <w:t>Psychologists who believe that willpower is a limited resource say using up our willpower is the main reason that some of us fail to achieve our goals.</w:t>
+      </w:r>
+    </w:p>
+    <w:p>
+      <w:pPr>
+        <w:spacing w:before="20" w:after="0"/>
+        <w:ind w:left="283" w:firstLine="0"/>
+      </w:pPr>
+      <w:r>
+        <w:rPr>
+          <w:rFonts w:eastAsia="MS Mincho" w:ascii="Times New Roman" w:hAnsi="Times New Roman"/>
+          <w:b w:val="0"/>
+          <w:i w:val="0"/>
+          <w:sz w:val="19"/>
+          <w:u w:val="none"/>
+        </w:rPr>
+        <w:t>（記号）</w:t>
+      </w:r>
+    </w:p>
+    <w:p>
+      <w:pPr>
+        <w:spacing w:before="0" w:after="0"/>
+        <w:ind w:left="283" w:firstLine="0"/>
+      </w:pPr>
+      <w:r>
+        <w:rPr>
+          <w:rFonts w:eastAsia="MS Mincho" w:ascii="Times New Roman" w:hAnsi="Times New Roman"/>
+          <w:b w:val="0"/>
+          <w:i w:val="0"/>
+          <w:sz w:val="19"/>
+          <w:u w:val="none"/>
+          <w:highlight w:val="yellow"/>
+        </w:rPr>
+        <w:t>S[Psychologists [who believe 〈that willpower is a limited resource〉]] V[say] O〈using up our willpower is the main reason [that some of us fail to achieve our goals]〉.</w:t>
+      </w:r>
+    </w:p>
+    <w:p>
+      <w:pPr>
+        <w:spacing w:before="40" w:after="0"/>
+        <w:ind w:left="283" w:firstLine="0"/>
+      </w:pPr>
+      <w:r>
+        <w:rPr>
+          <w:rFonts w:eastAsia="MS Mincho" w:ascii="Times New Roman" w:hAnsi="Times New Roman"/>
+          <w:b w:val="0"/>
+          <w:i w:val="0"/>
+          <w:sz w:val="19"/>
+          <w:u w:val="none"/>
+        </w:rPr>
+        <w:t>（訳）</w:t>
+      </w:r>
+    </w:p>
+    <w:p>
+      <w:pPr>
+        <w:spacing w:before="0" w:after="0"/>
+        <w:ind w:left="283" w:firstLine="0"/>
+      </w:pPr>
+      <w:r>
+        <w:rPr>
+          <w:rFonts w:eastAsia="MS Mincho" w:ascii="Times New Roman" w:hAnsi="Times New Roman"/>
+          <w:b w:val="0"/>
+          <w:i w:val="0"/>
+          <w:sz w:val="19"/>
+          <w:u w:val="none"/>
+          <w:highlight w:val="yellow"/>
+        </w:rPr>
+        <w:t>意志力は限られた資源だと考える心理学者たちは、意志力を使い果たすことが、私たちの一部が目標を達成できない主な理由だと言う。</w:t>
+      </w:r>
+    </w:p>
+    <w:p/>
+    <w:p>
+      <w:pPr>
+        <w:spacing w:before="160" w:after="40"/>
+        <w:ind w:left="170" w:firstLine="0"/>
+      </w:pPr>
+      <w:r>
+        <w:rPr>
+          <w:rFonts w:eastAsia="MS Mincho" w:ascii="Times New Roman" w:hAnsi="Times New Roman"/>
+          <w:b w:val="0"/>
+          <w:i w:val="0"/>
+          <w:sz w:val="21"/>
+          <w:u w:val="none"/>
+        </w:rPr>
+        <w:t>下の５〜８の構文解釈が正しければア、間違っていればイを書きなさい。５〜６は SVOCM について、７〜８は句・節について（記号は〈名詞句・節〉　［形容詞句・節］　（副詞句・節））である。</w:t>
+      </w:r>
+    </w:p>
+    <w:p>
+      <w:pPr>
+        <w:spacing w:before="80" w:after="0"/>
+        <w:ind w:left="170" w:firstLine="0"/>
+      </w:pPr>
+      <w:r>
+        <w:rPr>
+          <w:rFonts w:eastAsia="MS Mincho" w:ascii="Times New Roman" w:hAnsi="Times New Roman"/>
+          <w:b/>
+          <w:i w:val="0"/>
+          <w:sz w:val="21"/>
+          <w:u w:val="none"/>
+        </w:rPr>
+        <w:t xml:space="preserve">　5.　</w:t>
+      </w:r>
+      <w:r>
+        <w:rPr>
+          <w:rFonts w:eastAsia="MS Mincho" w:ascii="Times New Roman" w:hAnsi="Times New Roman"/>
+          <w:b w:val="0"/>
+          <w:i w:val="0"/>
+          <w:sz w:val="21"/>
+          <w:u w:val="none"/>
+        </w:rPr>
+        <w:t>X-rays allowed them to look into their patients, identify where there were problems, and cure them.</w:t>
+      </w:r>
+    </w:p>
+    <w:p>
+      <w:pPr>
+        <w:spacing w:before="20" w:after="0"/>
+        <w:ind w:left="397" w:firstLine="0"/>
+      </w:pPr>
+      <w:r>
+        <w:rPr>
+          <w:rFonts w:eastAsia="MS Mincho" w:ascii="Times New Roman" w:hAnsi="Times New Roman"/>
+          <w:b w:val="0"/>
+          <w:i w:val="0"/>
+          <w:sz w:val="19"/>
+          <w:u w:val="none"/>
+        </w:rPr>
+        <w:t>S[X-rays] V[allowed] O[them] C[to look into their patients, identify where there were problems, and cure them].</w:t>
+      </w:r>
+    </w:p>
+    <w:p>
+      <w:pPr>
+        <w:spacing w:before="20" w:after="80"/>
+        <w:ind w:left="397" w:firstLine="0"/>
+      </w:pPr>
+      <w:r>
+        <w:rPr>
+          <w:rFonts w:eastAsia="MS Mincho" w:ascii="Times New Roman" w:hAnsi="Times New Roman"/>
+          <w:b/>
+          <w:i w:val="0"/>
+          <w:sz w:val="21"/>
+          <w:u w:val="none"/>
+          <w:highlight w:val="yellow"/>
+        </w:rPr>
+        <w:t>ア</w:t>
+      </w:r>
+      <w:r>
+        <w:rPr>
+          <w:rFonts w:eastAsia="MS Mincho" w:ascii="Times New Roman" w:hAnsi="Times New Roman"/>
+          <w:b w:val="0"/>
+          <w:i w:val="0"/>
+          <w:sz w:val="18"/>
+          <w:u w:val="none"/>
+          <w:highlight w:val="yellow"/>
+        </w:rPr>
+        <w:t xml:space="preserve">　ア（正しい）：allow O to do = SVOC の構造。</w:t>
+      </w:r>
+    </w:p>
+    <w:p>
+      <w:pPr>
+        <w:spacing w:before="80" w:after="0"/>
+        <w:ind w:left="170" w:firstLine="0"/>
+      </w:pPr>
+      <w:r>
+        <w:rPr>
+          <w:rFonts w:eastAsia="MS Mincho" w:ascii="Times New Roman" w:hAnsi="Times New Roman"/>
+          <w:b/>
+          <w:i w:val="0"/>
+          <w:sz w:val="21"/>
+          <w:u w:val="none"/>
+        </w:rPr>
+        <w:t xml:space="preserve">　6.　</w:t>
+      </w:r>
+      <w:r>
+        <w:rPr>
+          <w:rFonts w:eastAsia="MS Mincho" w:ascii="Times New Roman" w:hAnsi="Times New Roman"/>
+          <w:b w:val="0"/>
+          <w:i w:val="0"/>
+          <w:sz w:val="21"/>
+          <w:u w:val="none"/>
+        </w:rPr>
+        <w:t>Willpower is a mysterious force that helps us control our actions and achieve our goals.</w:t>
+      </w:r>
+    </w:p>
+    <w:p>
+      <w:pPr>
+        <w:spacing w:before="20" w:after="0"/>
+        <w:ind w:left="397" w:firstLine="0"/>
+      </w:pPr>
+      <w:r>
+        <w:rPr>
+          <w:rFonts w:eastAsia="MS Mincho" w:ascii="Times New Roman" w:hAnsi="Times New Roman"/>
+          <w:b w:val="0"/>
+          <w:i w:val="0"/>
+          <w:sz w:val="19"/>
+          <w:u w:val="none"/>
+        </w:rPr>
+        <w:t>S[Willpower] V[is] C[a mysterious] M（force [that helps us control our actions and achieve our goals]）.</w:t>
+      </w:r>
+    </w:p>
+    <w:p>
+      <w:pPr>
+        <w:spacing w:before="20" w:after="80"/>
+        <w:ind w:left="397" w:firstLine="0"/>
+      </w:pPr>
+      <w:r>
+        <w:rPr>
+          <w:rFonts w:eastAsia="MS Mincho" w:ascii="Times New Roman" w:hAnsi="Times New Roman"/>
+          <w:b/>
+          <w:i w:val="0"/>
+          <w:sz w:val="21"/>
+          <w:u w:val="none"/>
+          <w:highlight w:val="yellow"/>
+        </w:rPr>
+        <w:t>イ</w:t>
+      </w:r>
+      <w:r>
+        <w:rPr>
+          <w:rFonts w:eastAsia="MS Mincho" w:ascii="Times New Roman" w:hAnsi="Times New Roman"/>
+          <w:b w:val="0"/>
+          <w:i w:val="0"/>
+          <w:sz w:val="18"/>
+          <w:u w:val="none"/>
+          <w:highlight w:val="yellow"/>
+        </w:rPr>
+        <w:t xml:space="preserve">　イ（間違い）：C は「a mysterious force [that...]」全体。</w:t>
+      </w:r>
+    </w:p>
+    <w:p>
+      <w:pPr>
+        <w:spacing w:before="80" w:after="0"/>
+        <w:ind w:left="170" w:firstLine="0"/>
+      </w:pPr>
+      <w:r>
+        <w:rPr>
+          <w:rFonts w:eastAsia="MS Mincho" w:ascii="Times New Roman" w:hAnsi="Times New Roman"/>
+          <w:b/>
+          <w:i w:val="0"/>
+          <w:sz w:val="21"/>
+          <w:u w:val="none"/>
+        </w:rPr>
+        <w:t xml:space="preserve">　7.　</w:t>
+      </w:r>
+      <w:r>
+        <w:rPr>
+          <w:rFonts w:eastAsia="MS Mincho" w:ascii="Times New Roman" w:hAnsi="Times New Roman"/>
+          <w:b w:val="0"/>
+          <w:i w:val="0"/>
+          <w:sz w:val="21"/>
+          <w:u w:val="none"/>
+        </w:rPr>
+        <w:t>Chopik says he isn't suggesting we ignore our families, but that friends make us feel better.</w:t>
+      </w:r>
+    </w:p>
+    <w:p>
+      <w:pPr>
+        <w:spacing w:before="20" w:after="0"/>
+        <w:ind w:left="397" w:firstLine="0"/>
+      </w:pPr>
+      <w:r>
+        <w:rPr>
+          <w:rFonts w:eastAsia="MS Mincho" w:ascii="Times New Roman" w:hAnsi="Times New Roman"/>
+          <w:b w:val="0"/>
+          <w:i w:val="0"/>
+          <w:sz w:val="19"/>
+          <w:u w:val="none"/>
+        </w:rPr>
+        <w:t>S[Chopik] V[says] O〈he isn't suggesting 〈we ignore our families〉, but 〈that friends make us feel better〉〉.</w:t>
+      </w:r>
+    </w:p>
+    <w:p>
+      <w:pPr>
+        <w:spacing w:before="20" w:after="80"/>
+        <w:ind w:left="397" w:firstLine="0"/>
+      </w:pPr>
+      <w:r>
+        <w:rPr>
+          <w:rFonts w:eastAsia="MS Mincho" w:ascii="Times New Roman" w:hAnsi="Times New Roman"/>
+          <w:b/>
+          <w:i w:val="0"/>
+          <w:sz w:val="21"/>
+          <w:u w:val="none"/>
+          <w:highlight w:val="yellow"/>
+        </w:rPr>
+        <w:t>ア</w:t>
+      </w:r>
+      <w:r>
+        <w:rPr>
+          <w:rFonts w:eastAsia="MS Mincho" w:ascii="Times New Roman" w:hAnsi="Times New Roman"/>
+          <w:b w:val="0"/>
+          <w:i w:val="0"/>
+          <w:sz w:val="18"/>
+          <w:u w:val="none"/>
+          <w:highlight w:val="yellow"/>
+        </w:rPr>
+        <w:t xml:space="preserve">　ア（正しい）：says の目的語節の中に suggesting の目的語節が2つ並列。</w:t>
+      </w:r>
+    </w:p>
+    <w:p>
+      <w:pPr>
+        <w:spacing w:before="80" w:after="0"/>
+        <w:ind w:left="170" w:firstLine="0"/>
+      </w:pPr>
+      <w:r>
+        <w:rPr>
+          <w:rFonts w:eastAsia="MS Mincho" w:ascii="Times New Roman" w:hAnsi="Times New Roman"/>
+          <w:b/>
+          <w:i w:val="0"/>
+          <w:sz w:val="21"/>
+          <w:u w:val="none"/>
+        </w:rPr>
+        <w:t xml:space="preserve">　8.　</w:t>
+      </w:r>
+      <w:r>
+        <w:rPr>
+          <w:rFonts w:eastAsia="MS Mincho" w:ascii="Times New Roman" w:hAnsi="Times New Roman"/>
+          <w:b w:val="0"/>
+          <w:i w:val="0"/>
+          <w:sz w:val="21"/>
+          <w:u w:val="none"/>
+        </w:rPr>
+        <w:t>With friends you are more likely to do activities — they provide an outlet.</w:t>
+      </w:r>
+    </w:p>
+    <w:p>
+      <w:pPr>
+        <w:spacing w:before="20" w:after="0"/>
+        <w:ind w:left="397" w:firstLine="0"/>
+      </w:pPr>
+      <w:r>
+        <w:rPr>
+          <w:rFonts w:eastAsia="MS Mincho" w:ascii="Times New Roman" w:hAnsi="Times New Roman"/>
+          <w:b w:val="0"/>
+          <w:i w:val="0"/>
+          <w:sz w:val="19"/>
+          <w:u w:val="none"/>
+        </w:rPr>
+        <w:t>M（With friends）S[you] V[are] C[more likely to do activities] M（— they provide an outlet）.</w:t>
+      </w:r>
+    </w:p>
+    <w:p>
+      <w:pPr>
+        <w:spacing w:before="20" w:after="80"/>
+        <w:ind w:left="397" w:firstLine="0"/>
+      </w:pPr>
+      <w:r>
+        <w:rPr>
+          <w:rFonts w:eastAsia="MS Mincho" w:ascii="Times New Roman" w:hAnsi="Times New Roman"/>
+          <w:b/>
+          <w:i w:val="0"/>
+          <w:sz w:val="21"/>
+          <w:u w:val="none"/>
+          <w:highlight w:val="yellow"/>
+        </w:rPr>
+        <w:t>イ</w:t>
+      </w:r>
+      <w:r>
+        <w:rPr>
+          <w:rFonts w:eastAsia="MS Mincho" w:ascii="Times New Roman" w:hAnsi="Times New Roman"/>
+          <w:b w:val="0"/>
+          <w:i w:val="0"/>
+          <w:sz w:val="18"/>
+          <w:u w:val="none"/>
+          <w:highlight w:val="yellow"/>
+        </w:rPr>
+        <w:t xml:space="preserve">　イ（間違い）：ダッシュ以降の「they provide an outlet」は独立した節。</w:t>
+      </w:r>
+    </w:p>
+    <w:p>
+      <w:pPr>
+        <w:spacing w:before="120" w:after="120"/>
+        <w:ind w:left="0" w:firstLine="0"/>
+        <w:jc w:val="center"/>
+      </w:pPr>
+      <w:r>
+        <w:rPr>
+          <w:rFonts w:eastAsia="MS Mincho" w:ascii="Times New Roman" w:hAnsi="Times New Roman"/>
+          <w:b/>
+          <w:i w:val="0"/>
+          <w:sz w:val="21"/>
+          <w:u w:val="none"/>
+          <w:highlight w:val="yellow"/>
+        </w:rPr>
+        <w:t>５ア　６イ　７ア　８イ</w:t>
+      </w:r>
+    </w:p>
     <w:p>
       <w:pPr>
         <w:spacing w:before="160" w:after="40"/>

</xml_diff>

<commit_message>
Fix exam issues from review: alternative answers, scoring labels, instructions
- 大問2 オ: in short → nevertheless
- 大問3: add 記号で答えなさい
- 大問5: add 各4点：構造2点・和訳2点 to section header
- 大問6(1): every/day format to eliminate alternative answers (every/about)
- 大問6(4): getting enough sleep... to eliminate alternative answers (is/need)
- 大問7: add 番号で答えなさい
- Answersheet ANSWERS q1: crisis→universal, rush→conduct, facial→recognition
- Answersheet ANSWERS q6: updated to match new q6 items

Co-Authored-By: Claude Sonnet 4.6 <noreply@anthropic.com>
Claude-Session: https://claude.ai/code/session_015DW3MeoTGzyTVFtzJFvLng
</commit_message>
<xml_diff>
--- a/output/exam_comm2_final.docx
+++ b/output/exam_comm2_final.docx
@@ -150,7 +150,7 @@
           <w:sz w:val="21"/>
           <w:u w:val="none"/>
         </w:rPr>
-        <w:t>(2)　彼らの政府は深刻な</w:t>
+        <w:t>(2)　平和への願いは</w:t>
       </w:r>
       <w:r>
         <w:rPr>
@@ -160,7 +160,7 @@
           <w:sz w:val="21"/>
           <w:u w:val="single"/>
         </w:rPr>
-        <w:t>財政危機</w:t>
+        <w:t>万国共通</w:t>
       </w:r>
       <w:r>
         <w:rPr>
@@ -170,7 +170,7 @@
           <w:sz w:val="21"/>
           <w:u w:val="none"/>
         </w:rPr>
-        <w:t>にある。</w:t>
+        <w:t>です。</w:t>
       </w:r>
       <w:r>
         <w:rPr>
@@ -191,7 +191,7 @@
           <w:u w:val="none"/>
           <w:highlight w:val="yellow"/>
         </w:rPr>
-        <w:t>crisis</w:t>
+        <w:t>universal</w:t>
       </w:r>
     </w:p>
     <w:p>
@@ -208,7 +208,7 @@
           <w:sz w:val="21"/>
           <w:u w:val="none"/>
         </w:rPr>
-        <w:t>Their government is in a serious financial （　　　　　　）.</w:t>
+        <w:t>Hope for peace is （　　　　　　　　）.</w:t>
       </w:r>
     </w:p>
     <w:p>
@@ -458,7 +458,7 @@
           <w:sz w:val="21"/>
           <w:u w:val="none"/>
         </w:rPr>
-        <w:t>(6)　彼女は</w:t>
+        <w:t>(6)　生徒会は全生徒に</w:t>
       </w:r>
       <w:r>
         <w:rPr>
@@ -468,7 +468,7 @@
           <w:sz w:val="21"/>
           <w:u w:val="single"/>
         </w:rPr>
-        <w:t>ラッシュアワーの</w:t>
+        <w:t>調査を行う</w:t>
       </w:r>
       <w:r>
         <w:rPr>
@@ -478,7 +478,7 @@
           <w:sz w:val="21"/>
           <w:u w:val="none"/>
         </w:rPr>
-        <w:t>渋滞に巻き込まれて会議に遅れた。</w:t>
+        <w:t>つもりです。</w:t>
       </w:r>
       <w:r>
         <w:rPr>
@@ -499,7 +499,7 @@
           <w:u w:val="none"/>
           <w:highlight w:val="yellow"/>
         </w:rPr>
-        <w:t>rush</w:t>
+        <w:t>conduct</w:t>
       </w:r>
     </w:p>
     <w:p>
@@ -516,7 +516,7 @@
           <w:sz w:val="21"/>
           <w:u w:val="none"/>
         </w:rPr>
-        <w:t>She was caught in （　　　　） hour traffic and was late for the meeting.</w:t>
+        <w:t>The student council is going to （　　　　　　　） a survey of all the students.</w:t>
       </w:r>
     </w:p>
     <w:p>
@@ -612,7 +612,7 @@
           <w:sz w:val="21"/>
           <w:u w:val="none"/>
         </w:rPr>
-        <w:t>(8)　そのシステムは</w:t>
+        <w:t>(8)　そのシステムは顔</w:t>
       </w:r>
       <w:r>
         <w:rPr>
@@ -622,7 +622,7 @@
           <w:sz w:val="21"/>
           <w:u w:val="single"/>
         </w:rPr>
-        <w:t>顔認識</w:t>
+        <w:t>認識</w:t>
       </w:r>
       <w:r>
         <w:rPr>
@@ -653,7 +653,7 @@
           <w:u w:val="none"/>
           <w:highlight w:val="yellow"/>
         </w:rPr>
-        <w:t>facial</w:t>
+        <w:t>recognition</w:t>
       </w:r>
     </w:p>
     <w:p>
@@ -670,7 +670,7 @@
           <w:sz w:val="21"/>
           <w:u w:val="none"/>
         </w:rPr>
-        <w:t>The system uses （　　　　） recognition technology.</w:t>
+        <w:t>The system uses facial （　　　　　　　　　） technology.</w:t>
       </w:r>
     </w:p>
     <w:p>
@@ -1089,7 +1089,7 @@
           <w:sz w:val="21"/>
           <w:u w:val="none"/>
         </w:rPr>
-        <w:t>[ ア it's true that ／ イ in this way ／ ウ similarly ／ エ what's more ／ オ in short ]</w:t>
+        <w:t>[ ア it's true that ／ イ in this way ／ ウ similarly ／ エ what's more ／ オ nevertheless ]</w:t>
       </w:r>
       <w:r>
         <w:rPr>
@@ -1168,7 +1168,7 @@
           <w:sz w:val="21"/>
           <w:u w:val="none"/>
         </w:rPr>
-        <w:t xml:space="preserve">　Choose the best word for each blank from options ア to エ.</w:t>
+        <w:t xml:space="preserve">　Choose the best word for each blank from options ア to エ. 記号で答えなさい。</w:t>
       </w:r>
       <w:r>
         <w:rPr>
@@ -1499,7 +1499,7 @@
           <w:sz w:val="21"/>
           <w:u w:val="none"/>
         </w:rPr>
-        <w:t xml:space="preserve">　以下の英文解釈に関する問題に答えなさい。</w:t>
+        <w:t xml:space="preserve">　以下の英文解釈に関する問題に答えなさい。（各4点：構造2点・和訳2点）</w:t>
       </w:r>
       <w:r>
         <w:rPr>
@@ -2577,7 +2577,7 @@
           <w:sz w:val="21"/>
           <w:u w:val="none"/>
         </w:rPr>
-        <w:t xml:space="preserve">　1．定期的に運動する人々は自分自身により満足している。</w:t>
+        <w:t xml:space="preserve">　1．毎日運動する人々は自分自身により満足している。</w:t>
       </w:r>
       <w:r>
         <w:rPr>
@@ -2598,7 +2598,7 @@
           <w:u w:val="none"/>
           <w:highlight w:val="yellow"/>
         </w:rPr>
-        <w:t>regularly / themselves</w:t>
+        <w:t>every / about</w:t>
       </w:r>
     </w:p>
     <w:p>
@@ -2615,7 +2615,7 @@
           <w:sz w:val="21"/>
           <w:u w:val="none"/>
         </w:rPr>
-        <w:t>( those / who / exercise / regularly / feel / better / about / themselves ).</w:t>
+        <w:t>( those / who / exercise / every / day / feel / better / about ) themselves.</w:t>
       </w:r>
     </w:p>
     <w:p>
@@ -2632,7 +2632,7 @@
           <w:sz w:val="19"/>
           <w:u w:val="none"/>
         </w:rPr>
-        <w:t>Those who exercise regularly feel better about themselves.</w:t>
+        <w:t>Those who exercise every day feel better about themselves.</w:t>
       </w:r>
     </w:p>
     <w:p>
@@ -2802,7 +2802,7 @@
           <w:sz w:val="21"/>
           <w:u w:val="none"/>
         </w:rPr>
-        <w:t xml:space="preserve">　4．あなたに必要なのは十分な睡眠だ。</w:t>
+        <w:t xml:space="preserve">　4．十分な睡眠をとることが、あなたに本当に必要なことだ。</w:t>
       </w:r>
       <w:r>
         <w:rPr>
@@ -2823,7 +2823,7 @@
           <w:u w:val="none"/>
           <w:highlight w:val="yellow"/>
         </w:rPr>
-        <w:t>is / sleep</w:t>
+        <w:t>is / need</w:t>
       </w:r>
     </w:p>
     <w:p>
@@ -2840,7 +2840,7 @@
           <w:sz w:val="21"/>
           <w:u w:val="none"/>
         </w:rPr>
-        <w:t>( what / you / need / is / to / get / enough / sleep ).</w:t>
+        <w:t>( getting / enough / sleep / is / what / you / really / need ).</w:t>
       </w:r>
     </w:p>
     <w:p>
@@ -2857,7 +2857,7 @@
           <w:sz w:val="19"/>
           <w:u w:val="none"/>
         </w:rPr>
-        <w:t>What you need is to get enough sleep.</w:t>
+        <w:t>Getting enough sleep is what you really need.</w:t>
       </w:r>
     </w:p>
     <w:p>
@@ -2959,7 +2959,7 @@
           <w:sz w:val="21"/>
           <w:u w:val="none"/>
         </w:rPr>
-        <w:t xml:space="preserve">　以下の英文を読み、各問いに答えなさい。</w:t>
+        <w:t xml:space="preserve">　以下の英文を読み、各問いに答えなさい。番号で答えなさい。</w:t>
       </w:r>
       <w:r>
         <w:rPr>

</xml_diff>

<commit_message>
Fix q1(8): test facial (workbook answer) instead of recognition
The workbook L4 Part1①(1) answer is 'facial', so the exam blank
must target 'facial'. English now reads: 'uses （　） recognition technology.'

Co-Authored-By: Claude Sonnet 4.6 <noreply@anthropic.com>
Claude-Session: https://claude.ai/code/session_015DW3MeoTGzyTVFtzJFvLng
</commit_message>
<xml_diff>
--- a/output/exam_comm2_final.docx
+++ b/output/exam_comm2_final.docx
@@ -612,7 +612,7 @@
           <w:sz w:val="21"/>
           <w:u w:val="none"/>
         </w:rPr>
-        <w:t>(8)　そのシステムは顔</w:t>
+        <w:t>(8)　そのシステムは</w:t>
       </w:r>
       <w:r>
         <w:rPr>
@@ -622,7 +622,7 @@
           <w:sz w:val="21"/>
           <w:u w:val="single"/>
         </w:rPr>
-        <w:t>認識</w:t>
+        <w:t>顔</w:t>
       </w:r>
       <w:r>
         <w:rPr>
@@ -632,7 +632,7 @@
           <w:sz w:val="21"/>
           <w:u w:val="none"/>
         </w:rPr>
-        <w:t>技術を使用している。</w:t>
+        <w:t>認識技術を使用している。</w:t>
       </w:r>
       <w:r>
         <w:rPr>
@@ -653,7 +653,7 @@
           <w:u w:val="none"/>
           <w:highlight w:val="yellow"/>
         </w:rPr>
-        <w:t>recognition</w:t>
+        <w:t>facial</w:t>
       </w:r>
     </w:p>
     <w:p>
@@ -670,7 +670,7 @@
           <w:sz w:val="21"/>
           <w:u w:val="none"/>
         </w:rPr>
-        <w:t>The system uses facial （　　　　　　　　　） technology.</w:t>
+        <w:t>The system uses （　　　　　　） recognition technology.</w:t>
       </w:r>
     </w:p>
     <w:p>

</xml_diff>

<commit_message>
大問6: 4番目/8番目 → 2番目/5番目, add 語句 grouping to fix alternative answers
- exercise regularly and is to get are now single phrases to eliminate alternatives
- Instruction updated: 語 → 語句, 4番目・8番目 → 2番目・5番目
- New answers: (1)who/better (2)off/what (3)the/I (4)you/enough (5)make/people

Co-Authored-By: Claude Sonnet 4.6 <noreply@anthropic.com>
Claude-Session: https://claude.ai/code/session_015DW3MeoTGzyTVFtzJFvLng
</commit_message>
<xml_diff>
--- a/output/exam_comm2_final.docx
+++ b/output/exam_comm2_final.docx
@@ -2547,7 +2547,7 @@
           <w:sz w:val="21"/>
           <w:u w:val="none"/>
         </w:rPr>
-        <w:t xml:space="preserve">　日本語の意味を表す英文になるように語を並べ替え，（　）内の４番目と８番目（文頭からではなく，（　）内であることに注意）に来る語を解答欄に記入しなさい。（解答欄に記入するのは１語ずつである。また，文頭に来る語も１文字目は小文字になっている）</w:t>
+        <w:t xml:space="preserve">　日本語の意味を表す英文になるように（　）内の語句を並べ替え，（　）内で２番目と５番目に来る語句を解答欄に記入しなさい。解答欄には１語句ずつ記入すること。なお，複数の単語からなる選択肢も一つの語句として数える。また，文頭に来る語も１文字目は小文字になっている。</w:t>
       </w:r>
       <w:r>
         <w:rPr>
@@ -2577,7 +2577,7 @@
           <w:sz w:val="21"/>
           <w:u w:val="none"/>
         </w:rPr>
-        <w:t xml:space="preserve">　1．毎日運動する人々は自分自身により満足している。</w:t>
+        <w:t xml:space="preserve">　1．定期的に運動する人々は自分自身により満足している。</w:t>
       </w:r>
       <w:r>
         <w:rPr>
@@ -2598,7 +2598,7 @@
           <w:u w:val="none"/>
           <w:highlight w:val="yellow"/>
         </w:rPr>
-        <w:t>every / about</w:t>
+        <w:t>2番目:who / 5番目:better</w:t>
       </w:r>
     </w:p>
     <w:p>
@@ -2615,7 +2615,7 @@
           <w:sz w:val="21"/>
           <w:u w:val="none"/>
         </w:rPr>
-        <w:t>( those / who / exercise / every / day / feel / better / about ) themselves.</w:t>
+        <w:t>( those / who / exercise regularly / feel / better / about / themselves ).</w:t>
       </w:r>
     </w:p>
     <w:p>
@@ -2632,7 +2632,7 @@
           <w:sz w:val="19"/>
           <w:u w:val="none"/>
         </w:rPr>
-        <w:t>Those who exercise every day feel better about themselves.</w:t>
+        <w:t>Those who exercise regularly feel better about themselves.</w:t>
       </w:r>
     </w:p>
     <w:p>
@@ -2673,7 +2673,7 @@
           <w:u w:val="none"/>
           <w:highlight w:val="yellow"/>
         </w:rPr>
-        <w:t>tomorrow / do</w:t>
+        <w:t>2番目:off / 5番目:what</w:t>
       </w:r>
     </w:p>
     <w:p>
@@ -2748,7 +2748,7 @@
           <w:u w:val="none"/>
           <w:highlight w:val="yellow"/>
         </w:rPr>
-        <w:t>who / win</w:t>
+        <w:t>2番目:the / 5番目:I</w:t>
       </w:r>
     </w:p>
     <w:p>
@@ -2802,7 +2802,7 @@
           <w:sz w:val="21"/>
           <w:u w:val="none"/>
         </w:rPr>
-        <w:t xml:space="preserve">　4．十分な睡眠をとることが、あなたに本当に必要なことだ。</w:t>
+        <w:t xml:space="preserve">　4．十分な睡眠をとることが、あなたに必要なことだ。</w:t>
       </w:r>
       <w:r>
         <w:rPr>
@@ -2823,7 +2823,7 @@
           <w:u w:val="none"/>
           <w:highlight w:val="yellow"/>
         </w:rPr>
-        <w:t>is / need</w:t>
+        <w:t>2番目:you / 5番目:enough</w:t>
       </w:r>
     </w:p>
     <w:p>
@@ -2840,7 +2840,7 @@
           <w:sz w:val="21"/>
           <w:u w:val="none"/>
         </w:rPr>
-        <w:t>( getting / enough / sleep / is / what / you / really / need ).</w:t>
+        <w:t>( what / you / need / is to get / enough / sleep ).</w:t>
       </w:r>
     </w:p>
     <w:p>
@@ -2857,7 +2857,7 @@
           <w:sz w:val="19"/>
           <w:u w:val="none"/>
         </w:rPr>
-        <w:t>Getting enough sleep is what you really need.</w:t>
+        <w:t>What you need is to get enough sleep.</w:t>
       </w:r>
     </w:p>
     <w:p>
@@ -2898,7 +2898,7 @@
           <w:u w:val="none"/>
           <w:highlight w:val="yellow"/>
         </w:rPr>
-        <w:t>with / you</w:t>
+        <w:t>2番目:make / 5番目:people</w:t>
       </w:r>
     </w:p>
     <w:p>

</xml_diff>